<commit_message>
feliz primero de mayo
</commit_message>
<xml_diff>
--- a/obsidian-history-vault-master/03 writing/documents/Drafts/Estallido/Título del ensayo.docx
+++ b/obsidian-history-vault-master/03 writing/documents/Drafts/Estallido/Título del ensayo.docx
@@ -4,16 +4,17 @@
   <w:body>
     <w:p>
       <w:pPr>
-        <w:pStyle w:val="Ttulo"/>
-        <w:rPr>
-          <w:lang w:val="es-PE"/>
-        </w:rPr>
-      </w:pPr>
-      <w:r>
-        <w:rPr>
-          <w:lang w:val="es-PE"/>
-        </w:rPr>
-        <w:t>Título del ensayo</w:t>
+        <w:pStyle w:val="Textoindependiente"/>
+        <w:rPr>
+          <w:lang w:val="es-PE"/>
+        </w:rPr>
+      </w:pPr>
+      <w:bookmarkStart w:id="0" w:name="X435b2cdbb7052c2167d7629c1bd681cabcb5083"/>
+      <w:r>
+        <w:rPr>
+          <w:lang w:val="es-PE"/>
+        </w:rPr>
+        <w:t>2023-04-21</w:t>
       </w:r>
     </w:p>
     <w:p>
@@ -23,12 +24,19 @@
           <w:lang w:val="es-PE"/>
         </w:rPr>
       </w:pPr>
-      <w:bookmarkStart w:id="0" w:name="Xd585eb05931e84172ffec5063d07c7bd88f6e54"/>
-      <w:r>
-        <w:rPr>
-          <w:lang w:val="es-PE"/>
-        </w:rPr>
-        <w:t>La fundación de la patria por el verdadero Perú. Pueblo, lucha y nueva consciencia en el proceso de construcción de poder popular en los Andes1(#_ftn1)</w:t>
+      <w:bookmarkStart w:id="1" w:name="X7313d64f5632f0a1f09c688432e2480ac45282d"/>
+      <w:bookmarkEnd w:id="0"/>
+      <w:r>
+        <w:rPr>
+          <w:lang w:val="es-PE"/>
+        </w:rPr>
+        <w:t>La fundación de la patria por el verdadero Perú. Pueblo, lucha y nueva consciencia en el proceso de constru</w:t>
+      </w:r>
+      <w:r>
+        <w:rPr>
+          <w:lang w:val="es-PE"/>
+        </w:rPr>
+        <w:t>cción de poder popular en los Andes1(#_ftn1)</w:t>
       </w:r>
     </w:p>
     <w:p>
@@ -42,7 +50,13 @@
         <w:rPr>
           <w:lang w:val="es-PE"/>
         </w:rPr>
-        <w:t xml:space="preserve">Tras la derrota más reciente de Keiko Fujimori en las elecciones presidenciales del 2021, el fujimorismo intentó sistemáticamente vacar al electo presidente Pedro Castillo desde el Congreso de la República. El 7 de diciembre de 2022, habiendo meses atrás cooptado a la entonces vicepresidenta Dina </w:t>
+        <w:t>Tras la derrota más reciente de Keiko Fujimori en las elecciones presidenciales del 2021, el fujimorismo intentó sistemáticamente vacar al electo presidente Pedro Castillo desde el Congreso de la República. El 7</w:t>
+      </w:r>
+      <w:r>
+        <w:rPr>
+          <w:lang w:val="es-PE"/>
+        </w:rPr>
+        <w:t xml:space="preserve"> de diciembre de 2022, habiendo meses atrás cooptado a la entonces vicepresidenta Dina </w:t>
       </w:r>
       <w:proofErr w:type="spellStart"/>
       <w:r>
@@ -56,13 +70,39 @@
         <w:rPr>
           <w:lang w:val="es-PE"/>
         </w:rPr>
-        <w:t xml:space="preserve">, el Congreso controlado por el fujimorismo utilizó una declaración pública realizada por Pedro Castillo para justificar su captura y apresamiento por parte del Comando Conjunto de las Fuerzas Armadas, acusándolo de traición a la patria. De esta manera Dina </w:t>
+        <w:t>, el Congreso controlado por el fujimorismo empleó una declaración pública realizada por Pedro Castillo para justificar su captura y apresamiento por parte del C</w:t>
+      </w:r>
+      <w:r>
+        <w:rPr>
+          <w:lang w:val="es-PE"/>
+        </w:rPr>
+        <w:t>omando Conjunto de las Fuerzas Armadas, acusándolo de traición a la patria, sin juicio político ni ordinario, ni sentencia judicial. Solo con un supuesto comunicado suscrito cobardemente por una oficina de prensa, comunicación e imagen institucional bajo u</w:t>
+      </w:r>
+      <w:r>
+        <w:rPr>
+          <w:lang w:val="es-PE"/>
+        </w:rPr>
+        <w:t>na nomenclatura y numeración ilusoria, ni siquiera firmado (</w:t>
       </w:r>
       <w:proofErr w:type="spellStart"/>
       <w:r>
         <w:rPr>
           <w:lang w:val="es-PE"/>
         </w:rPr>
+        <w:t>Fig</w:t>
+      </w:r>
+      <w:proofErr w:type="spellEnd"/>
+      <w:r>
+        <w:rPr>
+          <w:lang w:val="es-PE"/>
+        </w:rPr>
+        <w:t xml:space="preserve"> 1). De esta manera, Dina </w:t>
+      </w:r>
+      <w:proofErr w:type="spellStart"/>
+      <w:r>
+        <w:rPr>
+          <w:lang w:val="es-PE"/>
+        </w:rPr>
         <w:t>Boluarte</w:t>
       </w:r>
       <w:proofErr w:type="spellEnd"/>
@@ -84,39 +124,113 @@
         <w:rPr>
           <w:lang w:val="es-PE"/>
         </w:rPr>
-        <w:t xml:space="preserve">, que para sostenerse en el poder ha asesinado con disparos de bala a más de </w:t>
-      </w:r>
-      <w:r>
-        <w:rPr>
-          <w:lang w:val="es-PE"/>
-        </w:rPr>
-        <w:t>76</w:t>
-      </w:r>
-      <w:r>
-        <w:rPr>
-          <w:lang w:val="es-PE"/>
-        </w:rPr>
-        <w:t xml:space="preserve"> campesinos y jóvenes que salieron a protestar masivamente contra el control absoluto del estado peruano ejercido por la mafia criminal que dirigen Vladimiro Montesinos, Alberto Fujimori y Keiko Fujimori desde la cárcel.</w:t>
-      </w:r>
-    </w:p>
-    <w:p>
-      <w:pPr>
-        <w:pStyle w:val="Textoindependiente"/>
-        <w:rPr>
-          <w:lang w:val="es-PE"/>
-        </w:rPr>
-      </w:pPr>
-      <w:r>
-        <w:rPr>
-          <w:lang w:val="es-PE"/>
-        </w:rPr>
-        <w:t xml:space="preserve">Estos autores atrás del golpe de estado contra la frágil democracia y el estado de derecho en el Perú, ya han sido sentenciados por crímenes de megacorrupción y violaciones de derechos humanos, algunos de ellos incluso por el derecho internacional. Sin embargo, el legado institucional de diez años de dictadura les ha permitido mover desde la cárcel hilos que cruzan todo el aparato estatal, desde el Tribunal Constitucional, el Congreso de la República, el Poder Judicial, las Fuerzas Armadas y Policía Nacional del Perú, y -nuevamente- después del 7 de diciembre del año pasado, todo el gobierno central. La dictadura actual que ejerce el fujimorismo a través de la ilegal e ilegítima presidencia de Dina </w:t>
+        <w:t>, que para sostenerse en el poder ha asesinado con disparos de bala a más de 76 cam</w:t>
+      </w:r>
+      <w:r>
+        <w:rPr>
+          <w:lang w:val="es-PE"/>
+        </w:rPr>
+        <w:t>pesinos y jóvenes que salieron a protestar masivamente contra el control absoluto del estado peruano ejercido por esa organización criminal.</w:t>
+      </w:r>
+    </w:p>
+    <w:p>
+      <w:pPr>
+        <w:pStyle w:val="Textoindependiente"/>
+        <w:rPr>
+          <w:lang w:val="es-PE"/>
+        </w:rPr>
+      </w:pPr>
+      <w:r>
+        <w:rPr>
+          <w:lang w:val="es-PE"/>
+        </w:rPr>
+        <w:t xml:space="preserve">Algunos de los miembros más inescrupulosos de esta organización criminal que coordinó el golpe de estado contra la </w:t>
+      </w:r>
+      <w:r>
+        <w:rPr>
+          <w:lang w:val="es-PE"/>
+        </w:rPr>
+        <w:t xml:space="preserve">frágil democracia y el estado de derecho en el Perú ya han sido sentenciados por crímenes de </w:t>
       </w:r>
       <w:proofErr w:type="spellStart"/>
       <w:r>
         <w:rPr>
           <w:lang w:val="es-PE"/>
         </w:rPr>
+        <w:t>mega-corrupción</w:t>
+      </w:r>
+      <w:proofErr w:type="spellEnd"/>
+      <w:r>
+        <w:rPr>
+          <w:lang w:val="es-PE"/>
+        </w:rPr>
+        <w:t xml:space="preserve"> y violaciones de derechos humanos, algunos de ellos incluso por el derecho internacional como Alberto Fujimori y el </w:t>
+      </w:r>
+      <w:proofErr w:type="spellStart"/>
+      <w:r>
+        <w:rPr>
+          <w:lang w:val="es-PE"/>
+        </w:rPr>
+        <w:t>ex-agente</w:t>
+      </w:r>
+      <w:proofErr w:type="spellEnd"/>
+      <w:r>
+        <w:rPr>
+          <w:lang w:val="es-PE"/>
+        </w:rPr>
+        <w:t xml:space="preserve"> de la CIA y asesor pr</w:t>
+      </w:r>
+      <w:r>
+        <w:rPr>
+          <w:lang w:val="es-PE"/>
+        </w:rPr>
+        <w:t xml:space="preserve">esidencial Vladimiro Montesinos, y otros como los </w:t>
+      </w:r>
+      <w:proofErr w:type="spellStart"/>
+      <w:r>
+        <w:rPr>
+          <w:lang w:val="es-PE"/>
+        </w:rPr>
+        <w:t>ex-congresistas</w:t>
+      </w:r>
+      <w:proofErr w:type="spellEnd"/>
+      <w:r>
+        <w:rPr>
+          <w:lang w:val="es-PE"/>
+        </w:rPr>
+        <w:t xml:space="preserve"> Joaquín Ramírez y Keiko Fujimori están siendo procesados por lavado de activos de 183 millones de dólares. El legado institucional de diez años de dictadura les ha permitido mover desde la c</w:t>
+      </w:r>
+      <w:r>
+        <w:rPr>
+          <w:lang w:val="es-PE"/>
+        </w:rPr>
+        <w:t>árcel hilos que cruzan todo el aparato estatal, desde el Tribunal Constitucional, el Congreso de la República, el Poder Judicial, las Fuerzas Armadas y Policía Nacional del Perú, y -nuevamente- después del 7 de diciembre del año pasado, todo el gobierno ce</w:t>
+      </w:r>
+      <w:r>
+        <w:rPr>
+          <w:lang w:val="es-PE"/>
+        </w:rPr>
+        <w:t xml:space="preserve">ntral. </w:t>
+      </w:r>
+    </w:p>
+    <w:p>
+      <w:pPr>
+        <w:pStyle w:val="Textoindependiente"/>
+        <w:rPr>
+          <w:lang w:val="es-PE"/>
+        </w:rPr>
+      </w:pPr>
+      <w:r>
+        <w:rPr>
+          <w:lang w:val="es-PE"/>
+        </w:rPr>
+        <w:t xml:space="preserve">La dictadura actual que ejerce el fujimorismo a través de la ilegal e ilegítima presidencia de Dina </w:t>
+      </w:r>
+      <w:proofErr w:type="spellStart"/>
+      <w:r>
+        <w:rPr>
+          <w:lang w:val="es-PE"/>
+        </w:rPr>
         <w:t>Boluarte</w:t>
       </w:r>
       <w:proofErr w:type="spellEnd"/>
@@ -138,20 +252,39 @@
         <w:rPr>
           <w:lang w:val="es-PE"/>
         </w:rPr>
-        <w:t>, así como sobre el racismo que difunde el monopolio de los medios de comunicación, televisión, radio y prensa escrita que avalaron y defendieron al régimen autoritario de Fujimori desde 1990 hasta el 2000 y lo continúan haciendo hasta hoy. Desinformando a la opinión pública internacional y acusando injustamente a quienes están siendo asesinados en las calles como “terroristas”, cuando en realidad la valiente respuesta de las organizaciones sociales de base del Perú profundo es una clara muestra de su fe en la promesa democrática.</w:t>
-      </w:r>
-    </w:p>
-    <w:p>
-      <w:pPr>
-        <w:pStyle w:val="Textoindependiente"/>
-        <w:rPr>
-          <w:lang w:val="es-PE"/>
-        </w:rPr>
-      </w:pPr>
-      <w:r>
-        <w:rPr>
-          <w:lang w:val="es-PE"/>
-        </w:rPr>
+        <w:t>, a</w:t>
+      </w:r>
+      <w:r>
+        <w:rPr>
+          <w:lang w:val="es-PE"/>
+        </w:rPr>
+        <w:t>sí como sobre el racismo que difunde el monopolio de los medios de comunicación, televisión, radio y prensa escrita que avalaron y defendieron al régimen autoritario de Fujimori desde 1990 hasta el 2000 y lo continúan haciendo hasta hoy. Desinformando a la</w:t>
+      </w:r>
+      <w:r>
+        <w:rPr>
+          <w:lang w:val="es-PE"/>
+        </w:rPr>
+        <w:t xml:space="preserve"> opinión pública internacional y acusando injustamente a quienes están siendo asesinados en las calles como “terroristas”, cuando en realidad la valiente respuesta de las organizaciones sociales de base del Perú profundo es una clara muestra de su fe en la</w:t>
+      </w:r>
+      <w:r>
+        <w:rPr>
+          <w:lang w:val="es-PE"/>
+        </w:rPr>
+        <w:t xml:space="preserve"> promesa democrática.</w:t>
+      </w:r>
+    </w:p>
+    <w:p>
+      <w:pPr>
+        <w:pStyle w:val="Textoindependiente"/>
+        <w:rPr>
+          <w:lang w:val="es-PE"/>
+        </w:rPr>
+      </w:pPr>
+      <w:r>
+        <w:rPr>
+          <w:lang w:val="es-PE"/>
+        </w:rPr>
+        <w:lastRenderedPageBreak/>
         <w:t xml:space="preserve">La respuesta masiva y creciente de las organizaciones sociales de base del verdadero Perú, rural, campesino, trabajador, indígena, cholo, pobre, frente a los asesinatos sistemáticos que ejecuta el aparato represivo del </w:t>
       </w:r>
       <w:proofErr w:type="spellStart"/>
@@ -159,6 +292,84 @@
         <w:rPr>
           <w:lang w:val="es-PE"/>
         </w:rPr>
+        <w:t>fujimontesinism</w:t>
+      </w:r>
+      <w:r>
+        <w:rPr>
+          <w:lang w:val="es-PE"/>
+        </w:rPr>
+        <w:t>o</w:t>
+      </w:r>
+      <w:proofErr w:type="spellEnd"/>
+      <w:r>
+        <w:rPr>
+          <w:lang w:val="es-PE"/>
+        </w:rPr>
+        <w:t>, tiene una explicación completamente humana, instintiva. No podemos mantenernos indiferentes al asesinato de un hermano, de un vecino, de una amiga, de un compañero, no podemos solo dejar que maten a los hijos de nuestro pueblo, que golpeen en el suelo a</w:t>
+      </w:r>
+      <w:r>
+        <w:rPr>
+          <w:lang w:val="es-PE"/>
+        </w:rPr>
+        <w:t xml:space="preserve"> nuestras madres, que disparen al cráneo de nuestros padres y hermanos. Mucho tiempo hemos soportado el abuso de autoridad, hemos estado callando absurdamente nuestro grito de protesta, hemos estado reprimiendo nuestra propia lucha. Pero llegó el momento e</w:t>
+      </w:r>
+      <w:r>
+        <w:rPr>
+          <w:lang w:val="es-PE"/>
+        </w:rPr>
+        <w:t xml:space="preserve">n que no pudimos callar más, en que la brutalidad con que nos arrebatan la riqueza, el racismo con que nos desprecian, la maldad con que se aprovechan de nosotros, dejó de tener un efecto desmovilizador, fragmentador, </w:t>
+      </w:r>
+      <w:proofErr w:type="spellStart"/>
+      <w:r>
+        <w:rPr>
+          <w:lang w:val="es-PE"/>
+        </w:rPr>
+        <w:t>despolitizante</w:t>
+      </w:r>
+      <w:proofErr w:type="spellEnd"/>
+      <w:r>
+        <w:rPr>
+          <w:lang w:val="es-PE"/>
+        </w:rPr>
+        <w:t>. Toda esa violencia est</w:t>
+      </w:r>
+      <w:r>
+        <w:rPr>
+          <w:lang w:val="es-PE"/>
+        </w:rPr>
+        <w:t>atal que sistemáticamente han ejercido las élites de la oligarquía limeña desde su control total del sistema político, del estado, del derecho y la ley, ha dejado en evidencia su fascismo corporativo, siendo el fujimorismo su pura expresión.</w:t>
+      </w:r>
+    </w:p>
+    <w:p>
+      <w:pPr>
+        <w:pStyle w:val="Textoindependiente"/>
+        <w:rPr>
+          <w:lang w:val="es-PE"/>
+        </w:rPr>
+      </w:pPr>
+      <w:r>
+        <w:rPr>
+          <w:lang w:val="es-PE"/>
+        </w:rPr>
+        <w:t>Pedro Castillo</w:t>
+      </w:r>
+      <w:r>
+        <w:rPr>
+          <w:lang w:val="es-PE"/>
+        </w:rPr>
+        <w:t xml:space="preserve"> es un prisionero político entre otros cientos que en el Perú actualmente no tienen ningún derecho, ninguna garantía constitucional, ninguna defensa más que la que ejercen las familias del pueblo peruano en las calles. Que sin más que sus cuerpos, palos, p</w:t>
+      </w:r>
+      <w:r>
+        <w:rPr>
+          <w:lang w:val="es-PE"/>
+        </w:rPr>
+        <w:t xml:space="preserve">iedras y escudos improvisados, se enfrentan a los disparos de bala que ejecutan las fuerzas armadas y policiales ordenadas por un gobierno de facto dirigido por la mafia criminal del </w:t>
+      </w:r>
+      <w:proofErr w:type="spellStart"/>
+      <w:r>
+        <w:rPr>
+          <w:lang w:val="es-PE"/>
+        </w:rPr>
         <w:t>fujimontesinismo</w:t>
       </w:r>
       <w:proofErr w:type="spellEnd"/>
@@ -166,56 +377,13 @@
         <w:rPr>
           <w:lang w:val="es-PE"/>
         </w:rPr>
-        <w:t xml:space="preserve">, tiene una explicación completamente humana. No podemos mantenernos indiferentes al asesinato de un hermano, de un vecino, de una amiga, de un compañero, no podemos solo dejar que maten a los hijos de nuestro pueblo, que golpeen en el suelo a nuestras </w:t>
-      </w:r>
-      <w:r>
-        <w:rPr>
-          <w:lang w:val="es-PE"/>
-        </w:rPr>
-        <w:lastRenderedPageBreak/>
-        <w:t xml:space="preserve">madres, que disparen al cráneo de nuestros padres y hermanos. Mucho tiempo hemos soportado el abuso de autoridad, hemos estado callando absurdamente nuestro grito de protesta, hemos estado reprimiendo nuestra propia lucha. Pero llegó el momento en que no pudimos callar más, en que la brutalidad con que nos arrebatan la riqueza, el racismo con que nos desprecian, la maldad con que se aprovechan de nosotros, dejó de tener un efecto desmovilizador, fragmentador, </w:t>
-      </w:r>
-      <w:proofErr w:type="spellStart"/>
-      <w:r>
-        <w:rPr>
-          <w:lang w:val="es-PE"/>
-        </w:rPr>
-        <w:t>despolitizante</w:t>
-      </w:r>
-      <w:proofErr w:type="spellEnd"/>
-      <w:r>
-        <w:rPr>
-          <w:lang w:val="es-PE"/>
-        </w:rPr>
-        <w:t>. Toda esa violencia estatal que sistemáticamente han ejercido las élites de la oligarquía limeña desde su control total del sistema político, del estado, del derecho y la ley, ha dejado en evidencia su fascismo corporativo, siendo el fujimorismo su pura expresión.</w:t>
-      </w:r>
-    </w:p>
-    <w:p>
-      <w:pPr>
-        <w:pStyle w:val="Textoindependiente"/>
-        <w:rPr>
-          <w:lang w:val="es-PE"/>
-        </w:rPr>
-      </w:pPr>
-      <w:r>
-        <w:rPr>
-          <w:lang w:val="es-PE"/>
-        </w:rPr>
-        <w:t xml:space="preserve">Pedro Castillo es un prisionero político entre otros cientos que en el Perú actualmente no tienen ningún derecho, ninguna garantía constitucional, ninguna defensa más que la que ejercen las familias del pueblo peruano en las calles. Que sin más que sus cuerpos, palos, piedras y escudos improvisados, se enfrentan a los disparos de bala que ejecutan las fuerzas armadas y policiales ordenadas por un gobierno de facto dirigido por la mafia criminal del </w:t>
-      </w:r>
-      <w:proofErr w:type="spellStart"/>
-      <w:r>
-        <w:rPr>
-          <w:lang w:val="es-PE"/>
-        </w:rPr>
-        <w:t>fujimontesinismo</w:t>
-      </w:r>
-      <w:proofErr w:type="spellEnd"/>
-      <w:r>
-        <w:rPr>
-          <w:lang w:val="es-PE"/>
-        </w:rPr>
-        <w:t xml:space="preserve">. Las masivas movilizaciones que realiza el pueblo peruano en pie de lucha no tienen como fin devolver a Pedro Castillo a la presidencia, sino recuperar el Perú y la esperanza de un futuro verdaderamente democrático para el pueblo peruano. </w:t>
+        <w:t>. Las masivas movilizaciones que realiza el pueblo peruan</w:t>
+      </w:r>
+      <w:r>
+        <w:rPr>
+          <w:lang w:val="es-PE"/>
+        </w:rPr>
+        <w:t xml:space="preserve">o en pie de lucha no tienen como fin devolver a Pedro Castillo a la presidencia, sino recuperar el Perú y la esperanza de un futuro verdaderamente democrático para el pueblo peruano. </w:t>
       </w:r>
       <w:r>
         <w:rPr>
@@ -225,21 +393,7 @@
           <w:iCs/>
           <w:lang w:val="es-PE"/>
         </w:rPr>
-        <w:t>Cuando aquel, el pueblo peruano, no es más una categoría abstracta de interpretación, ni una ficción jurídica, sino un cuerpo vivo común de carne y hueso, con rasgos marcados por una historia de abuso racista y explotación, despierto y decidido a cambiar su futuro. Esta lucha heroica del pueblo peruano es el evento fundacional de la patria en el Perú, momento histórico sin precedentes, incomparable; a los ojos de la república oligárquica, de las élites limeñas, simplemente incomprensible.</w:t>
-      </w:r>
-    </w:p>
-    <w:p>
-      <w:pPr>
-        <w:pStyle w:val="Textoindependiente"/>
-        <w:rPr>
-          <w:lang w:val="es-PE"/>
-        </w:rPr>
-      </w:pPr>
-      <w:r>
-        <w:rPr>
-          <w:lang w:val="es-PE"/>
-        </w:rPr>
-        <w:t xml:space="preserve">Los pueblos de todo el mundo observan consternados el admirable sacrificio y supremo valor de la verdadera lucha, aquella que da la vida por la vida, una ética que no puede sino ser aprendida por medio de la experiencia. Una nueva consciencia se manifiesta y avanza sin esperar un líder, partido o ideología, abriéndose paso por medio de la única forma de vida que conoce: la lucha por vivir. Lejana del egoísmo que este sistema de muerte nos impregna, florece una nueva ética de vida, de verdadera humanidad, que ya no nos permite dejar atrás a los demás y avanzar por encima. Esa nueva consciencia ha despertado en el pueblo peruano, una solidaridad inmensa avanza a la refundación de la patria, al reconocimiento histórico, y no solo al cambio de constitución, gobierno o autoridades. Otro pueblo en el mundo ha despertado, es el </w:t>
+        <w:t>Cuando aquel, el pueblo peruano, no es más una categoría abstracta de int</w:t>
       </w:r>
       <w:r>
         <w:rPr>
@@ -249,296 +403,7 @@
           <w:iCs/>
           <w:lang w:val="es-PE"/>
         </w:rPr>
-        <w:t>verdadero Perú</w:t>
-      </w:r>
-      <w:r>
-        <w:rPr>
-          <w:lang w:val="es-PE"/>
-        </w:rPr>
-        <w:t>.</w:t>
-      </w:r>
-    </w:p>
-    <w:p>
-      <w:pPr>
-        <w:pStyle w:val="Textoindependiente"/>
-        <w:rPr>
-          <w:lang w:val="es-PE"/>
-        </w:rPr>
-      </w:pPr>
-      <w:bookmarkStart w:id="1" w:name="apéndice"/>
-      <w:r>
-        <w:rPr>
-          <w:lang w:val="es-PE"/>
-        </w:rPr>
-        <w:t>Apéndice</w:t>
-      </w:r>
-      <w:r>
-        <w:rPr>
-          <w:lang w:val="es-PE"/>
-        </w:rPr>
-        <w:br/>
-      </w:r>
-      <w:r>
-        <w:rPr>
-          <w:lang w:val="es-PE"/>
-        </w:rPr>
-        <w:br/>
-        <w:t>Desde el 7 de diciembre de 2022 se han realizado en el país movilizaciones populares en Lima, así como en las regiones del sur andino: Ayacucho, Puno, Cusco, Apurímac, Arequipa y en el norte del departamento La Libertad. La respuesta estatal ha sido la represión de las manifestaciones con fuerza letal teniendo a la fecha un saldo de 62 muertos, más de 900 heridos, cerca de 1.800 encausados y criminalizados por ejercer la protesta social; y docenas de detenciones arbitrarias, donde sobresale la ausencia en muchas ocasiones de fiscales y/o abogados(as) defensores(as),</w:t>
-      </w:r>
-      <w:r>
-        <w:rPr>
-          <w:lang w:val="es-PE"/>
-        </w:rPr>
-        <w:br/>
-      </w:r>
-      <w:r>
-        <w:rPr>
-          <w:lang w:val="es-PE"/>
-        </w:rPr>
-        <w:lastRenderedPageBreak/>
-        <w:t>En efecto, la cantidad oficial de víctimas fatales de represión estatal durante las manifestaciones de protesta civil supera las 76 personas al 1/3/2023, aunque desde las organizaciones civiles independientes este número no resulta preciso, siendo en algunos casos mayor. Los listados e información de las víctimas recabadas por la Misión se encuentran a disposición de los organismos internacionales.</w:t>
-      </w:r>
-    </w:p>
-    <w:p>
-      <w:pPr>
-        <w:pStyle w:val="Ttulo1"/>
-        <w:rPr>
-          <w:lang w:val="es-PE"/>
-        </w:rPr>
-      </w:pPr>
-      <w:bookmarkStart w:id="2" w:name="X435b2cdbb7052c2167d7629c1bd681cabcb5083"/>
-      <w:bookmarkEnd w:id="0"/>
-      <w:bookmarkEnd w:id="1"/>
-      <w:r>
-        <w:rPr>
-          <w:lang w:val="es-PE"/>
-        </w:rPr>
-        <w:t>El estallido en los Andes y su significancia internacional para el desarrollo de la lucha de clases</w:t>
-      </w:r>
-    </w:p>
-    <w:p>
-      <w:pPr>
-        <w:pStyle w:val="FirstParagraph"/>
-        <w:rPr>
-          <w:lang w:val="es-PE"/>
-        </w:rPr>
-      </w:pPr>
-    </w:p>
-    <w:p>
-      <w:pPr>
-        <w:pStyle w:val="Textodebloque"/>
-      </w:pPr>
-      <w:r>
-        <w:t xml:space="preserve">Podía verse cómo las esquinas que, como escalones, desde ahí hasta la Av. Chile, iban vaciándose. </w:t>
-      </w:r>
-      <w:r>
-        <w:t>Perdimos el Puente Guambra.</w:t>
-      </w:r>
-      <w:r>
-        <w:t xml:space="preserve"> En la Plaza San Blas se habían quedado </w:t>
-      </w:r>
-      <w:r>
-        <w:t>algunos</w:t>
-      </w:r>
-      <w:r>
-        <w:t xml:space="preserve"> manifestantes de la retaguardia de la movilización, cuando </w:t>
-      </w:r>
-      <w:r>
-        <w:t>regresé al frente por la Av. Gran Colombia, solo quedaba uno con una bandera del Mejía en la espalda, cuando de repente la caballería salió a toda</w:t>
-      </w:r>
-      <w:r>
-        <w:t xml:space="preserve"> </w:t>
-      </w:r>
-      <w:r>
-        <w:t xml:space="preserve">en dirección </w:t>
-      </w:r>
-      <w:r>
-        <w:t>nuestra</w:t>
-      </w:r>
-      <w:r>
-        <w:t xml:space="preserve">. </w:t>
-      </w:r>
-      <w:r>
-        <w:t>A él n</w:t>
-      </w:r>
-      <w:r>
-        <w:t xml:space="preserve">o lo vi correr, ni intentarlo, corrí hacia la Plaza San Blas por la misma avenida </w:t>
-      </w:r>
-      <w:r>
-        <w:t>alertando</w:t>
-      </w:r>
-      <w:r>
-        <w:t xml:space="preserve"> a la masa que seguía consternada por los eventos de esa tarde</w:t>
-      </w:r>
-      <w:r>
-        <w:t>,</w:t>
-      </w:r>
-      <w:r>
-        <w:t xml:space="preserve"> tras la promulgación del Decreto </w:t>
-      </w:r>
-      <w:r>
-        <w:t>No 883</w:t>
-      </w:r>
-      <w:r>
-        <w:t xml:space="preserve"> </w:t>
-      </w:r>
-      <w:r>
-        <w:t>que aplicaba</w:t>
-      </w:r>
-      <w:r>
-        <w:t xml:space="preserve"> un shock económico que eliminaba el subsidio a los combustibles.</w:t>
-      </w:r>
-      <w:r>
-        <w:t xml:space="preserve"> La masa reunida en la Plaza San Blas no ejercía ningún acto de protesta propiamente sino más bien de libre reunión y conversación. Sin embargo, la represión policial de la policía montada, motorizada y </w:t>
-      </w:r>
-      <w:proofErr w:type="spellStart"/>
-      <w:r>
-        <w:t>anti</w:t>
-      </w:r>
-      <w:r>
-        <w:t>-</w:t>
-      </w:r>
-      <w:r>
-        <w:t>motín</w:t>
-      </w:r>
-      <w:proofErr w:type="spellEnd"/>
-      <w:r>
-        <w:t xml:space="preserve"> consistió en un ataque no en una acción defensiva</w:t>
-      </w:r>
-      <w:r>
-        <w:t xml:space="preserve"> del estado</w:t>
-      </w:r>
-      <w:r>
-        <w:t xml:space="preserve"> frente a una potencial amenaza representada por la masa reunida en la Plaza San Blas</w:t>
-      </w:r>
-      <w:r>
-        <w:t>.</w:t>
-      </w:r>
-      <w:r>
-        <w:t xml:space="preserve"> </w:t>
-      </w:r>
-      <w:r>
-        <w:t>C</w:t>
-      </w:r>
-      <w:r>
-        <w:t>uando la violencia estatal se dirigió hacia aquel lu</w:t>
-      </w:r>
-      <w:r>
-        <w:t>gar aquel día para perseguir, gasear y disparar a quien sea que se encuentre a su alcance. Algunos de nosotros nos refugiamos en un edificio antiguo cercano, a través de cuya reja baja la Avenida Caldas hacia el centro de Quito pudimos aguantar a punta de piedra a la columna policial que iba persiguiendo y golpeando a la masa que corría subiendo la avenida. Uno de los policías sacó su pistola apuntando en dirección a nosotros</w:t>
-      </w:r>
-      <w:r>
-        <w:t xml:space="preserve"> acercándose a la reja con una herramienta para cortar el candado de la reja. Lo logró gracias a la ayuda del guardia del edificio, seguramente un expolicía. La policía entró al conjunto habitacional para perseguirnos, cogieron a uno de nosotros en el estacionamiento para darle en el suelo. Los demás entramos a </w:t>
-      </w:r>
-      <w:r>
-        <w:t>las viviendas</w:t>
-      </w:r>
-      <w:r>
-        <w:t xml:space="preserve"> que nos abrieron las puertas, segundos antes de ser capturados</w:t>
-      </w:r>
-      <w:r>
-        <w:t>.</w:t>
-      </w:r>
-    </w:p>
-    <w:p>
-      <w:pPr>
-        <w:pStyle w:val="Textoindependiente"/>
-        <w:rPr>
-          <w:lang w:val="es-PE"/>
-        </w:rPr>
-      </w:pPr>
-    </w:p>
-    <w:p>
-      <w:pPr>
-        <w:pStyle w:val="FirstParagraph"/>
-        <w:rPr>
-          <w:lang w:val="es-PE"/>
-        </w:rPr>
-      </w:pPr>
-      <w:r>
-        <w:rPr>
-          <w:lang w:val="es-PE"/>
-        </w:rPr>
-        <w:t xml:space="preserve">La magnitud de la represión estatal a la lucha del 03 de octubre de 2019 en respuesta al paquetazo neoliberal </w:t>
-      </w:r>
-      <w:r>
-        <w:rPr>
-          <w:lang w:val="es-PE"/>
-        </w:rPr>
-        <w:t xml:space="preserve">estaba predispuesta, </w:t>
-      </w:r>
-      <w:r>
-        <w:rPr>
-          <w:lang w:val="es-PE"/>
-        </w:rPr>
-        <w:t xml:space="preserve">esa tarde la policía se comportó como un ejército en ataque contra la masa reunida en la Plaza San Blas, esa masa no representaba ninguna amenaza para el estado, ni para la policía, se encontraba reunida pacíficamente y a </w:t>
-      </w:r>
-      <w:r>
-        <w:rPr>
-          <w:lang w:val="es-PE"/>
-        </w:rPr>
-        <w:t xml:space="preserve">cuadras de distancia de donde se dieron los enfrentamientos aquel día. Al menos una hora antes de que la policía realice el ataque contra la masa que no protestaba ya, los enfrentamientos se habían disuelto. La operación de represión militarizada estaba programada para desincentivar cualquier respuesta popular al paquetazo neoliberal que daba Moreno en el gobierno, y se debía realizar con una magnitud extraordinaria. Así fue, pese a que los manifestantes nos </w:t>
-      </w:r>
-      <w:r>
-        <w:rPr>
-          <w:lang w:val="es-PE"/>
-        </w:rPr>
-        <w:lastRenderedPageBreak/>
-        <w:t xml:space="preserve">retiramos de los enfrentamientos mucho antes de que la policía montada, motorizada y </w:t>
-      </w:r>
-      <w:proofErr w:type="spellStart"/>
-      <w:r>
-        <w:rPr>
-          <w:lang w:val="es-PE"/>
-        </w:rPr>
-        <w:t>anti-motín</w:t>
-      </w:r>
-      <w:proofErr w:type="spellEnd"/>
-      <w:r>
-        <w:rPr>
-          <w:lang w:val="es-PE"/>
-        </w:rPr>
-        <w:t xml:space="preserve"> arremeta su ofensiva contra la masa </w:t>
-      </w:r>
-      <w:r>
-        <w:rPr>
-          <w:lang w:val="es-PE"/>
-        </w:rPr>
-        <w:t>reunida pacíficamente.</w:t>
-      </w:r>
-    </w:p>
-    <w:p>
-      <w:pPr>
-        <w:pStyle w:val="Textoindependiente"/>
-        <w:rPr>
-          <w:lang w:val="es-PE"/>
-        </w:rPr>
-      </w:pPr>
-      <w:r>
-        <w:rPr>
-          <w:lang w:val="es-PE"/>
-        </w:rPr>
-        <w:t>La experiencia simultánea de lucha en Chile evidenciaba que la escala de la intervención neoliberal y la magnitud de la represión militarizada no era un carácter singular de</w:t>
-      </w:r>
-    </w:p>
-    <w:p>
-      <w:pPr>
-        <w:pStyle w:val="FirstParagraph"/>
-        <w:rPr>
-          <w:lang w:val="es-PE"/>
-        </w:rPr>
-      </w:pPr>
-      <w:r>
-        <w:rPr>
-          <w:lang w:val="es-PE"/>
-        </w:rPr>
-        <w:t>Desde el 03 de octubre de 2019 a la actualidad, el desarrollo de la lucha política en los Andes comprende una cadena de estallidos que supera la escala de los episodios de movilización precedentes. La masividad de las luchas más recientes, la magnitud de la violencia estatal empleada en su represión y la solidaridad que generan, evidencian no solo el desarrollo de un proceso de cambio de escala de la lucha política, sino también el de la lucha de clases.</w:t>
-      </w:r>
-      <w:r>
-        <w:rPr>
-          <w:lang w:val="es-PE"/>
-        </w:rPr>
-        <w:br/>
-        <w:t xml:space="preserve">Usualmente este proceso de cambio de escala se encuentra asociado con la transformación de luchas fragmentadas en campañas masivas y durables de lucha, y es indicado por un cambio cuantitativo en el número, duración, alcance e intensidad de las acciones de lucha política coordinada de diferentes desafiadores por una reivindicación o agenda reivindicativa común y antagónica a los intereses representados en el estado. Sin embargo, los resultados históricos del proceso de cambio de escala del conflicto político no se restringen a los episodios de lucha masivos y durables catalogados genéricamente como revoluciones, guerras civiles, insurrecciones, paros, rebeliones, levantamientos, huelgas. </w:t>
+        <w:t xml:space="preserve">erpretación, ni una ficción jurídica, sino un cuerpo vivo común de carne y hueso, con rasgos marcados por una historia de abuso racista y explotación, despierto y decidido a cambiar su futuro. Esta lucha heroica del pueblo peruano es el evento fundacional </w:t>
       </w:r>
       <w:r>
         <w:rPr>
@@ -548,15 +413,39 @@
           <w:iCs/>
           <w:lang w:val="es-PE"/>
         </w:rPr>
-        <w:t>La escalada de la lucha política</w:t>
-      </w:r>
-      <w:r>
-        <w:rPr>
-          <w:b/>
-          <w:bCs/>
-          <w:lang w:val="es-PE"/>
-        </w:rPr>
-        <w:t xml:space="preserve"> no solo produce la transformación de protestas atomizadas en desafíos coordinados de movilización masiva y sostenida, sino que </w:t>
+        <w:t>de la patria en el Perú, momento histórico sin precedentes, incomparable; a los ojos de la república oligárquica, de las élites limeñas, simplemente incomprensible.</w:t>
+      </w:r>
+    </w:p>
+    <w:p>
+      <w:pPr>
+        <w:pStyle w:val="Textoindependiente"/>
+        <w:rPr>
+          <w:lang w:val="es-PE"/>
+        </w:rPr>
+      </w:pPr>
+      <w:r>
+        <w:rPr>
+          <w:lang w:val="es-PE"/>
+        </w:rPr>
+        <w:t xml:space="preserve">Los pueblos de todo el mundo observan consternados el admirable sacrificio y supremo valor </w:t>
+      </w:r>
+      <w:r>
+        <w:rPr>
+          <w:lang w:val="es-PE"/>
+        </w:rPr>
+        <w:t xml:space="preserve">de la verdadera lucha, aquella que da la vida por la vida, una ética que no puede sino ser aprendida por medio de la experiencia. Una nueva consciencia se manifiesta y avanza sin esperar un líder, partido o ideología, abriéndose paso por medio de la única </w:t>
+      </w:r>
+      <w:r>
+        <w:rPr>
+          <w:lang w:val="es-PE"/>
+        </w:rPr>
+        <w:t xml:space="preserve">forma de vida que conoce: la lucha por vivir. Lejana del egoísmo que este sistema de muerte nos impregna, florece una nueva ética de vida, de verdadera humanidad, que ya no nos permite dejar atrás a los demás y avanzar por encima. Esa nueva consciencia ha </w:t>
+      </w:r>
+      <w:r>
+        <w:rPr>
+          <w:lang w:val="es-PE"/>
+        </w:rPr>
+        <w:t xml:space="preserve">despertado en el pueblo peruano, una solidaridad inmensa avanza a la refundación de la patria, al reconocimiento histórico, y no solo al cambio de constitución, gobierno o autoridades. Otro pueblo en el mundo ha despertado, es el </w:t>
       </w:r>
       <w:r>
         <w:rPr>
@@ -566,340 +455,1486 @@
           <w:iCs/>
           <w:lang w:val="es-PE"/>
         </w:rPr>
-        <w:t>permite el desarrollo del proceso de lucha de clases</w:t>
+        <w:t>verdadero Perú</w:t>
+      </w:r>
+      <w:r>
+        <w:rPr>
+          <w:lang w:val="es-PE"/>
+        </w:rPr>
+        <w:t>.</w:t>
+      </w:r>
+    </w:p>
+    <w:p>
+      <w:pPr>
+        <w:pStyle w:val="Textoindependiente"/>
+        <w:rPr>
+          <w:lang w:val="es-PE"/>
+        </w:rPr>
+      </w:pPr>
+      <w:r>
+        <w:rPr>
+          <w:lang w:val="es-PE"/>
+        </w:rPr>
+        <w:t xml:space="preserve">Desde el 7 de diciembre de 2022 se han realizado en el país movilizaciones populares en Lima, así como en las regiones del sur andino: Ayacucho, Puno, Cusco, Apurímac, </w:t>
+      </w:r>
+      <w:r>
+        <w:rPr>
+          <w:lang w:val="es-PE"/>
+        </w:rPr>
+        <w:lastRenderedPageBreak/>
+        <w:t>Arequipa y en el norte del departamento La Libertad. La respuesta estatal ha sido la rep</w:t>
+      </w:r>
+      <w:r>
+        <w:rPr>
+          <w:lang w:val="es-PE"/>
+        </w:rPr>
+        <w:t>resión de las manifestaciones con fuerza letal teniendo a la fecha un saldo de 62 muertos, más de 900 heridos, cerca de 1.800 encausados y criminalizados por ejercer la protesta social; y docenas de detenciones arbitrarias, donde sobresale la ausencia en m</w:t>
+      </w:r>
+      <w:r>
+        <w:rPr>
+          <w:lang w:val="es-PE"/>
+        </w:rPr>
+        <w:t>uchas ocasiones de fiscales y/o abogados(as) defensores(as),</w:t>
+      </w:r>
+      <w:r>
+        <w:rPr>
+          <w:lang w:val="es-PE"/>
+        </w:rPr>
+        <w:br/>
+        <w:t>En efecto, la cantidad oficial de víctimas fatales de represión estatal durante las manifestaciones de protesta civil supera las 76 personas al 1/3/2023, aunque desde las organizaciones civiles i</w:t>
+      </w:r>
+      <w:r>
+        <w:rPr>
+          <w:lang w:val="es-PE"/>
+        </w:rPr>
+        <w:t>ndependientes este número no resulta preciso, siendo en algunos casos mayor. Los listados e información de las víctimas recabadas por la Misión se encuentran a disposición de los organismos internacionales.</w:t>
+      </w:r>
+      <w:r>
+        <w:rPr>
+          <w:lang w:val="es-PE"/>
+        </w:rPr>
+        <w:br/>
+        <w:t>Sin embargo, la crisis de hegemonía a escala glob</w:t>
+      </w:r>
+      <w:r>
+        <w:rPr>
+          <w:lang w:val="es-PE"/>
+        </w:rPr>
+        <w:t>al es de tal agudeza que los dispositivos de dominación usualmente empleados para lograr el consentimiento de las masas por mecanismos democráticos han perdido absoluta eficacia para garantizar la vida frente al abuso del poder político estatal. No podemos</w:t>
+      </w:r>
+      <w:r>
+        <w:rPr>
+          <w:lang w:val="es-PE"/>
+        </w:rPr>
+        <w:t xml:space="preserve"> apelar al derecho internacional público, ni a la comunidad internacional, ni al derecho constitucional, para resolver la situación del pueblo peruano en su lucha contra la imposición de una nueva dictadura narco-extractiva.</w:t>
+      </w:r>
+    </w:p>
+    <w:p>
+      <w:pPr>
+        <w:pStyle w:val="Ttulo1"/>
+        <w:rPr>
+          <w:lang w:val="es-PE"/>
+        </w:rPr>
+      </w:pPr>
+      <w:bookmarkStart w:id="2" w:name="X1c97dde65c0aa13feffa55dc6068b47cb5e2c1b"/>
+      <w:bookmarkEnd w:id="1"/>
+      <w:r>
+        <w:rPr>
+          <w:lang w:val="es-PE"/>
+        </w:rPr>
+        <w:t xml:space="preserve">El estallido en los Andes y su </w:t>
+      </w:r>
+      <w:r>
+        <w:rPr>
+          <w:lang w:val="es-PE"/>
+        </w:rPr>
+        <w:t>significancia internacional para el desarrollo de la lucha de clases</w:t>
+      </w:r>
+    </w:p>
+    <w:p>
+      <w:pPr>
+        <w:pStyle w:val="FirstParagraph"/>
+        <w:rPr>
+          <w:lang w:val="es-PE"/>
+        </w:rPr>
+      </w:pPr>
+      <w:r>
+        <w:rPr>
+          <w:lang w:val="es-PE"/>
+        </w:rPr>
+        <w:t>Podía verse cómo las esquinas que, como escalones, desde el Puente Guambra hasta al menos la Avenida Chile, iban vaciándose. En la Plaza San Blas habían quedado rezagados algunos grupos d</w:t>
+      </w:r>
+      <w:r>
+        <w:rPr>
+          <w:lang w:val="es-PE"/>
+        </w:rPr>
+        <w:t>e manifestantes. Cuando regresé al frente por la Avenida Gran Colombia, sólo quedaba uno con una bandera del Mejía en la espalda; de repente, la caballería salió a toda en dirección nuestra. A él no lo vi intentarlo, yo corrí hacia la Plaza San Blas por la</w:t>
+      </w:r>
+      <w:r>
+        <w:rPr>
+          <w:lang w:val="es-PE"/>
+        </w:rPr>
+        <w:t xml:space="preserve"> misma avenida alertando a la masa que seguía consternada por los eventos de esa tarde tras la promulgación del Decreto No 883 que aplicaba un shock económico que, entre otras medidas, eliminaba el subsidio a los combustibles. La masa reunida no ejercía ni</w:t>
+      </w:r>
+      <w:r>
+        <w:rPr>
+          <w:lang w:val="es-PE"/>
+        </w:rPr>
+        <w:t xml:space="preserve">ngún acto de protesta propiamente sino más bien de libre reunión. Sin embargo, la represión de la policía montada, motorizada y </w:t>
+      </w:r>
+      <w:proofErr w:type="spellStart"/>
+      <w:r>
+        <w:rPr>
+          <w:lang w:val="es-PE"/>
+        </w:rPr>
+        <w:t>anti-motín</w:t>
+      </w:r>
+      <w:proofErr w:type="spellEnd"/>
+      <w:r>
+        <w:rPr>
+          <w:lang w:val="es-PE"/>
+        </w:rPr>
+        <w:t xml:space="preserve"> consistió en un ataque, no en una acción defensiva del estado frente a una potencial amenaza representada por la masa</w:t>
+      </w:r>
+      <w:r>
+        <w:rPr>
+          <w:lang w:val="es-PE"/>
+        </w:rPr>
+        <w:t xml:space="preserve"> reunida en la Plaza San Blas. Algunos de </w:t>
+      </w:r>
+      <w:proofErr w:type="spellStart"/>
+      <w:r>
+        <w:rPr>
+          <w:lang w:val="es-PE"/>
+        </w:rPr>
+        <w:t>nosotrxs</w:t>
+      </w:r>
+      <w:proofErr w:type="spellEnd"/>
+      <w:r>
+        <w:rPr>
+          <w:lang w:val="es-PE"/>
+        </w:rPr>
+        <w:t xml:space="preserve"> nos refugiamos en un edificio antiguo cercano a través de cuya reja pudimos aguantar a punta de piedra a la columna policial que iba persiguiendo y golpeando a la masa que salía disparada subiendo por la c</w:t>
+      </w:r>
+      <w:r>
+        <w:rPr>
+          <w:lang w:val="es-PE"/>
+        </w:rPr>
+        <w:t>alle Caldas. Uno de los policías sacó su pistola apuntando en dirección a nosotros mientras se acercaba a la reja con una herramienta para cortar el candado. Lo logró gracias a la ayuda del guardia del edificio. Un grupo de policías entró a perseguirnos al</w:t>
+      </w:r>
+      <w:r>
+        <w:rPr>
+          <w:lang w:val="es-PE"/>
+        </w:rPr>
+        <w:t xml:space="preserve"> conjunto habitacional mientras el resto de ellos siguió subiendo por la calle tras los manifestantes, ...entramos a las viviendas que pudimos segundos antes de ser capturados. A uno de </w:t>
+      </w:r>
+      <w:proofErr w:type="spellStart"/>
+      <w:r>
+        <w:rPr>
+          <w:lang w:val="es-PE"/>
+        </w:rPr>
+        <w:t>nosotrxs</w:t>
+      </w:r>
+      <w:proofErr w:type="spellEnd"/>
+      <w:r>
+        <w:rPr>
+          <w:lang w:val="es-PE"/>
+        </w:rPr>
+        <w:t xml:space="preserve"> le cogieron para darle palo en el suelo gritándole "perro".</w:t>
+      </w:r>
+    </w:p>
+    <w:p>
+      <w:pPr>
+        <w:pStyle w:val="Textoindependiente"/>
+        <w:rPr>
+          <w:lang w:val="es-PE"/>
+        </w:rPr>
+      </w:pPr>
+      <w:r>
+        <w:rPr>
+          <w:lang w:val="es-PE"/>
+        </w:rPr>
+        <w:t>L</w:t>
+      </w:r>
+      <w:r>
+        <w:rPr>
+          <w:lang w:val="es-PE"/>
+        </w:rPr>
+        <w:t xml:space="preserve">a magnitud de la represión estatal a la lucha del 03 de octubre de 2019 en respuesta al paquetazo neoliberal dado por el entonces gobierno de Moreno estaba </w:t>
+      </w:r>
+      <w:r>
+        <w:rPr>
+          <w:lang w:val="es-PE"/>
+        </w:rPr>
+        <w:lastRenderedPageBreak/>
+        <w:t>predispuesta. Esa tarde la policía se comportó como un ejército en ofensiva contra la masa reunida e</w:t>
+      </w:r>
+      <w:r>
+        <w:rPr>
+          <w:lang w:val="es-PE"/>
+        </w:rPr>
+        <w:t>n la Plaza San Blas, que no representaba ninguna amenaza para el estado, ni para la policía, se encontraba reunida pacíficamente y a cuadras de distancia de donde se dieron los enfrentamientos aquel día. Al menos una hora antes de que la policía realice el</w:t>
+      </w:r>
+      <w:r>
+        <w:rPr>
+          <w:lang w:val="es-PE"/>
+        </w:rPr>
+        <w:t xml:space="preserve"> ataque contra la masa que no protestaba, los enfrentamientos de esa tarde ya se habían disuelto. La operación de represión militarizada estaba programada para desincentivar cualquier respuesta popular al paquetazo neoliberal que daba Moreno en el gobierno</w:t>
+      </w:r>
+      <w:r>
+        <w:rPr>
+          <w:lang w:val="es-PE"/>
+        </w:rPr>
+        <w:t xml:space="preserve">, y se debía realizar con una magnitud extraordinaria. Así fue, pese a que los manifestantes nos retiramos de los enfrentamientos mucho antes de que la policía montada, motorizada y </w:t>
+      </w:r>
+      <w:proofErr w:type="spellStart"/>
+      <w:r>
+        <w:rPr>
+          <w:lang w:val="es-PE"/>
+        </w:rPr>
+        <w:t>anti-motín</w:t>
+      </w:r>
+      <w:proofErr w:type="spellEnd"/>
+      <w:r>
+        <w:rPr>
+          <w:lang w:val="es-PE"/>
+        </w:rPr>
+        <w:t xml:space="preserve"> arremeta su ofensiva contra la masa reunida pacíficamente.</w:t>
+      </w:r>
+    </w:p>
+    <w:p>
+      <w:pPr>
+        <w:pStyle w:val="Textoindependiente"/>
+        <w:rPr>
+          <w:lang w:val="es-PE"/>
+        </w:rPr>
+      </w:pPr>
+      <w:r>
+        <w:rPr>
+          <w:lang w:val="es-PE"/>
+        </w:rPr>
+        <w:t>Desd</w:t>
+      </w:r>
+      <w:r>
+        <w:rPr>
+          <w:lang w:val="es-PE"/>
+        </w:rPr>
+        <w:t xml:space="preserve">e entonces a la actualidad, el desarrollo de la lucha política en los Andes comprende una cadena de estallidos que supera la escala de los episodios de movilización precedentes. La masividad de las luchas más recientes, la magnitud de la violencia estatal </w:t>
+      </w:r>
+      <w:r>
+        <w:rPr>
+          <w:lang w:val="es-PE"/>
+        </w:rPr>
+        <w:t>empleada en su represión y la solidaridad que generan, evidencian no solo el desarrollo de un proceso de cambio de escala de la lucha política, sino también el del desarrollo de la lucha de clases.</w:t>
+      </w:r>
+    </w:p>
+    <w:p>
+      <w:pPr>
+        <w:pStyle w:val="Textoindependiente"/>
+        <w:rPr>
+          <w:lang w:val="es-PE"/>
+        </w:rPr>
+      </w:pPr>
+      <w:r>
+        <w:rPr>
+          <w:lang w:val="es-PE"/>
+        </w:rPr>
+        <w:t>Usualmente, este proceso de escalada se encuentra asociado</w:t>
+      </w:r>
+      <w:r>
+        <w:rPr>
+          <w:lang w:val="es-PE"/>
+        </w:rPr>
+        <w:t xml:space="preserve"> con el desarrollo de campañas masivas y durables de lucha, y es indicado por un cambio cuantitativo en el número, duración, alcance e intensidad de las acciones de lucha política coordinada de diferentes desafiadores por una reivindicación o agenda reivin</w:t>
+      </w:r>
+      <w:r>
+        <w:rPr>
+          <w:lang w:val="es-PE"/>
+        </w:rPr>
+        <w:t>dicativa común y antagónica a los intereses representados en el estado. Sin embargo, los resultados de la escalada de la lucha política no se restringen a los episodios de lucha masivos y durables catalogados genéricamente como revoluciones, guerras civile</w:t>
+      </w:r>
+      <w:r>
+        <w:rPr>
+          <w:lang w:val="es-PE"/>
+        </w:rPr>
+        <w:t>s, insurrecciones, paros, rebeliones, levantamientos, huelgas. La escalada de la lucha política no solo produce la transformación de protestas atomizadas en desafíos coordinados de movilización masiva y sostenida, sino que por medio de la experiencia de lu</w:t>
+      </w:r>
+      <w:r>
+        <w:rPr>
+          <w:lang w:val="es-PE"/>
+        </w:rPr>
+        <w:t xml:space="preserve">cha, solidaridad y polarización, las masas abren su consciencia al reconocimiento de la clase y de su propio instinto de clase en el enfrentamiento directo contra el estado desnudo como ejecutor de la violencia estatal a disposición de la dominación de la </w:t>
+      </w:r>
+      <w:r>
+        <w:rPr>
+          <w:lang w:val="es-PE"/>
+        </w:rPr>
+        <w:t>burguesía doméstica y la clase capitalista transnacional -de rostro extractivo en los Andes-.</w:t>
+      </w:r>
+    </w:p>
+    <w:p>
+      <w:pPr>
+        <w:pStyle w:val="Textoindependiente"/>
+        <w:rPr>
+          <w:lang w:val="es-PE"/>
+        </w:rPr>
+      </w:pPr>
+      <w:r>
+        <w:rPr>
+          <w:lang w:val="es-PE"/>
+        </w:rPr>
+        <w:t>En ese sentido, el carácter defensivo de la resistencia del campesinado indígena y cholo frente a la expansión de la frontera extractiva minera y petrolera desde inicios del siglo XXI, se mantiene como rasgo de la lucha de clases que se desarrolla en la ac</w:t>
+      </w:r>
+      <w:r>
+        <w:rPr>
+          <w:lang w:val="es-PE"/>
+        </w:rPr>
+        <w:t>tualidad con el estallido en los Andes contra la reversión de las condiciones políticas, económicas y culturales de reproducción del campesinado y del proletariado rural y urbano. Pero no es sólo el carácter de la lucha de clases en los Andes del siglo XXI</w:t>
+      </w:r>
+      <w:r>
+        <w:rPr>
+          <w:lang w:val="es-PE"/>
+        </w:rPr>
+        <w:t>, es genuinamente el carácter defensivo de la lucha indígena desarrollada desde el siglo XVI.</w:t>
+      </w:r>
+      <w:r>
+        <w:rPr>
+          <w:lang w:val="es-PE"/>
+        </w:rPr>
+        <w:br/>
+        <w:t>En ese sentido, la formación del proletariado en los Andes, o mejor dicho, la proletarización de su campesinado indígena, no solo se realiza por medio del desarro</w:t>
+      </w:r>
+      <w:r>
+        <w:rPr>
+          <w:lang w:val="es-PE"/>
+        </w:rPr>
+        <w:t xml:space="preserve">llo del capitalismo, sino que también es configurado por los mecanismos de </w:t>
+      </w:r>
+      <w:r>
+        <w:rPr>
+          <w:lang w:val="es-PE"/>
+        </w:rPr>
+        <w:lastRenderedPageBreak/>
+        <w:t>reproducción social de la fuerza viva explotada en la producción capitalista ajenos al salario</w:t>
+      </w:r>
+      <w:r>
+        <w:rPr>
+          <w:rStyle w:val="Refdenotaalpie"/>
+          <w:lang w:val="es-PE"/>
+        </w:rPr>
+        <w:footnoteReference w:id="1"/>
+      </w:r>
+      <w:r>
+        <w:rPr>
+          <w:lang w:val="es-PE"/>
+        </w:rPr>
+        <w:t>, sobre todo por medio de la lucha misma.</w:t>
+      </w:r>
+    </w:p>
+    <w:p>
+      <w:pPr>
+        <w:pStyle w:val="Textoindependiente"/>
+        <w:rPr>
+          <w:lang w:val="es-PE"/>
+        </w:rPr>
+      </w:pPr>
+      <w:r>
+        <w:rPr>
+          <w:lang w:val="es-PE"/>
+        </w:rPr>
+        <w:t>Pie de página:</w:t>
+      </w:r>
+      <w:r>
+        <w:rPr>
+          <w:lang w:val="es-PE"/>
+        </w:rPr>
+        <w:t xml:space="preserve"> </w:t>
+      </w:r>
+    </w:p>
+    <w:p>
+      <w:pPr>
+        <w:pStyle w:val="Textoindependiente"/>
+        <w:rPr>
+          <w:lang w:val="es-PE"/>
+        </w:rPr>
+      </w:pPr>
+      <w:r>
+        <w:rPr>
+          <w:lang w:val="es-PE"/>
+        </w:rPr>
+        <w:t>El desarrollo de la lucha de clases no solo implica el cambio de escala del conflicto político, sino que las vanguardias actúen definitivamente, estratégicamente contra la clase capitalista. Solo cuando</w:t>
+      </w:r>
+      <w:r>
+        <w:rPr>
+          <w:lang w:val="es-PE"/>
+        </w:rPr>
+        <w:t xml:space="preserve"> las luchas “localizadas, particularizadas, fragmentadas, atomizadas, despolitizadas”, se convierten en episodios de la lucha de clases, la masividad y el sacrificio de las movilizaciones configura con claridad un antagonismo de clases que se agudiza con l</w:t>
+      </w:r>
+      <w:r>
+        <w:rPr>
+          <w:lang w:val="es-PE"/>
+        </w:rPr>
+        <w:t>a bochornosa actuación del estado como guardián de las ganancias de la clase capitalista transnacional y las burguesías domésticas (financiera, minera, petrolera, agroexportadora y burocrática, principalmente) que configuran la dominación imperialista en l</w:t>
+      </w:r>
+      <w:r>
+        <w:rPr>
+          <w:lang w:val="es-PE"/>
+        </w:rPr>
+        <w:t>os Andes.</w:t>
+      </w:r>
+    </w:p>
+    <w:p>
+      <w:pPr>
+        <w:pStyle w:val="Textoindependiente"/>
+        <w:rPr>
+          <w:lang w:val="es-PE"/>
+        </w:rPr>
+      </w:pPr>
+      <w:r>
+        <w:rPr>
+          <w:lang w:val="es-PE"/>
+        </w:rPr>
+        <w:t>La clase capitalista transnacional, entre cuyas principales fracciones se encuentra la burguesía minera imperialista (no solo de origen estadounidense sino también Chino, Canadiense y Japones, por ejemplo), no puede ser sino jerárquica con las bu</w:t>
+      </w:r>
+      <w:r>
+        <w:rPr>
+          <w:lang w:val="es-PE"/>
+        </w:rPr>
+        <w:t xml:space="preserve">rguesías domésticas, en ese sentido, las burguesías domésticas andinas dependen de la magnitud del capital circulante en sus correspondientes industrias, dicha magnitud es ofrecida por la clase capitalista transnacional a través de la inversión extranjera </w:t>
+      </w:r>
+      <w:r>
+        <w:rPr>
+          <w:lang w:val="es-PE"/>
+        </w:rPr>
+        <w:t>directa. El establecimiento de las inversiones de grandes capitalistas en industrias de la región Andina está directamente asociado a la abundancia de sus recursos principalmente minerales y petroleros, desde el siglo XVI a la actualidad. Las burguesías mi</w:t>
+      </w:r>
+      <w:r>
+        <w:rPr>
+          <w:lang w:val="es-PE"/>
+        </w:rPr>
+        <w:t>neras imperialistas fueron las primeras en establecerse en nuestra Abya Yala. Así, durante el cuarto ciclo de acumulación sistémica con hegemonía estadounidense iniciado en el siglo XX, la minería fue uno de los sectores donde la inversión de capital produ</w:t>
+      </w:r>
+      <w:r>
+        <w:rPr>
+          <w:lang w:val="es-PE"/>
+        </w:rPr>
+        <w:t>ctivo minero estadounidense se concentró en la región Andina.</w:t>
+      </w:r>
+    </w:p>
+    <w:p>
+      <w:pPr>
+        <w:pStyle w:val="Textoindependiente"/>
+        <w:rPr>
+          <w:lang w:val="es-PE"/>
+        </w:rPr>
+      </w:pPr>
+      <w:r>
+        <w:rPr>
+          <w:lang w:val="es-PE"/>
+        </w:rPr>
+        <w:t xml:space="preserve">“Todos estamos de acuerdo en que nuestra tarea es organizar la lucha de clases del proletariado. «Pero </w:t>
+      </w:r>
+      <w:proofErr w:type="gramStart"/>
+      <w:r>
+        <w:rPr>
+          <w:lang w:val="es-PE"/>
+        </w:rPr>
+        <w:t>qué es la lucha de clases?</w:t>
+      </w:r>
+      <w:proofErr w:type="gramEnd"/>
+      <w:r>
+        <w:rPr>
+          <w:lang w:val="es-PE"/>
+        </w:rPr>
+        <w:t xml:space="preserve"> Cuando los obreros de una determinada fábrica, de un gremio dete</w:t>
+      </w:r>
+      <w:r>
+        <w:rPr>
+          <w:lang w:val="es-PE"/>
+        </w:rPr>
+        <w:t>rminado, inician una lucha contra su patrono, o sus patronos, ¿es eso lucha de clases? No; eso es tan sólo un débil comienzo. La lucha de los obreros se convierte en lucha de clases, sólo cuando los representantes de vanguardia de toda la clase obrera de u</w:t>
+      </w:r>
+      <w:r>
+        <w:rPr>
+          <w:lang w:val="es-PE"/>
+        </w:rPr>
+        <w:t xml:space="preserve">n país tienen conciencia de la unidad de la clase obrera y emprenden la lucha, no contra un patrono aislado, sino contra </w:t>
+      </w:r>
+      <w:r>
+        <w:rPr>
+          <w:i/>
+          <w:iCs/>
+          <w:lang w:val="es-PE"/>
+        </w:rPr>
+        <w:t xml:space="preserve">toda la </w:t>
+      </w:r>
+      <w:r>
+        <w:rPr>
+          <w:i/>
+          <w:iCs/>
+          <w:lang w:val="es-PE"/>
+        </w:rPr>
+        <w:lastRenderedPageBreak/>
+        <w:t>clase</w:t>
+      </w:r>
+      <w:r>
+        <w:rPr>
+          <w:lang w:val="es-PE"/>
+        </w:rPr>
+        <w:t xml:space="preserve"> capitalista y contra el gobierno que apoya a esa clase. Sólo cuando cada obrero tiene conciencia de ser parte de toda la </w:t>
+      </w:r>
+      <w:r>
+        <w:rPr>
+          <w:lang w:val="es-PE"/>
+        </w:rPr>
+        <w:t>clase obrera, cuando en su pequeña lucha cotidiana contra un patrono o un funcionario ve la lucha contra toda la burguesía y contra el gobierno en pleno, sólo entonces su lucha se transforma en lucha de clases” (Lenin [1899]1958, 213).</w:t>
+      </w:r>
+    </w:p>
+    <w:p>
+      <w:pPr>
+        <w:pStyle w:val="Textoindependiente"/>
+        <w:rPr>
+          <w:lang w:val="es-PE"/>
+        </w:rPr>
+      </w:pPr>
+      <w:r>
+        <w:rPr>
+          <w:lang w:val="es-PE"/>
+        </w:rPr>
+        <w:t>Sin embargo, a inici</w:t>
+      </w:r>
+      <w:r>
+        <w:rPr>
+          <w:lang w:val="es-PE"/>
+        </w:rPr>
+        <w:t xml:space="preserve">os del siglo XX Lenin escribía para las vanguardias proletarias que dentro de la socialdemocracia estaban conscientes de su capacidad de actuar como clase, más allá de cualquier afiliación, se hace claro en los episodios de lucha de clases que no hay otra </w:t>
+      </w:r>
+      <w:r>
+        <w:rPr>
+          <w:lang w:val="es-PE"/>
+        </w:rPr>
+        <w:t>forma humana de responder a la violencia estatal contra un pueblo movilizado más que salir en su defensa. La solidaridad de clase en el momento en que nos encontramos se expresa no tanto por la consciencia del proletariado organizado sino por la de su camp</w:t>
+      </w:r>
+      <w:r>
+        <w:rPr>
+          <w:lang w:val="es-PE"/>
+        </w:rPr>
+        <w:t>esinado organizado. Clase social en que se reconocen a las compañeras y compañeros asesinados.</w:t>
+      </w:r>
+    </w:p>
+    <w:p>
+      <w:pPr>
+        <w:pStyle w:val="Textoindependiente"/>
+        <w:rPr>
+          <w:lang w:val="es-PE"/>
+        </w:rPr>
+      </w:pPr>
+      <w:r>
+        <w:rPr>
+          <w:lang w:val="es-PE"/>
+        </w:rPr>
+        <w:t xml:space="preserve">En este punto, la lucha de clases en los Andes se expresa no tanto por la consciencia del proletariado organizado sino por la de su campesinado, asimismo, en el </w:t>
+      </w:r>
+      <w:r>
+        <w:rPr>
+          <w:lang w:val="es-PE"/>
+        </w:rPr>
+        <w:t>retorno del indio no solo se encuentra la reivindicación del indio y la tierra, sino que evoca al indio revolucionario. Seremos millones, advierte, y efectivamente son millones los que en los Andes sienten contundentemente la verdadera expresión de las con</w:t>
+      </w:r>
+      <w:r>
+        <w:rPr>
+          <w:lang w:val="es-PE"/>
+        </w:rPr>
+        <w:t>diciones de dominación y explotación capitalista, la represión militarizada ejercida contra las masas movilizadas puso en evidencia al estado en todo su esplendor como garante de la dominación imperialista. La violencia estatal se ejerce sobre campesinos y</w:t>
+      </w:r>
+      <w:r>
+        <w:rPr>
+          <w:lang w:val="es-PE"/>
+        </w:rPr>
+        <w:t xml:space="preserve"> estudiantes con brutalidad, les siguen en ese tratamiento todos los demás que se le oponen.</w:t>
+      </w:r>
+    </w:p>
+    <w:p>
+      <w:pPr>
+        <w:pStyle w:val="Textoindependiente"/>
+        <w:rPr>
+          <w:lang w:val="es-PE"/>
+        </w:rPr>
+      </w:pPr>
+      <w:r>
+        <w:rPr>
+          <w:lang w:val="es-PE"/>
+        </w:rPr>
+        <w:t>Más allá de las luchas políticas que cada desafiador realiza por demandas y reivindicaciones específicas, la lucha de clases se desarrolla con la experiencia masiv</w:t>
+      </w:r>
+      <w:r>
+        <w:rPr>
+          <w:lang w:val="es-PE"/>
+        </w:rPr>
+        <w:t>a del antagonismo de clase durante el enfrentamiento directo con el estado como guardián de la burguesía doméstica y el proceso de acumulación capitalista en los Andes dirigido por la burguesía extractiva transnacional. Quedando al desnudo el estado asesin</w:t>
+      </w:r>
+      <w:r>
+        <w:rPr>
+          <w:lang w:val="es-PE"/>
+        </w:rPr>
+        <w:t>o, mercenario para la acumulación capitalista, masacrando al pueblo movilizado en las calles, en ausencia de cualquier mecanismo institucional nacional o internacional que ponga límite a la impunidad.</w:t>
+      </w:r>
+    </w:p>
+    <w:p>
+      <w:pPr>
+        <w:pStyle w:val="Textoindependiente"/>
+        <w:rPr>
+          <w:lang w:val="es-PE"/>
+        </w:rPr>
+      </w:pPr>
+      <w:r>
+        <w:rPr>
+          <w:lang w:val="es-PE"/>
+        </w:rPr>
+        <w:t>La experiencia simultánea de lucha en Chile, así como p</w:t>
+      </w:r>
+      <w:r>
+        <w:rPr>
+          <w:lang w:val="es-PE"/>
+        </w:rPr>
+        <w:t xml:space="preserve">osteriormente en Bolivia, Colombia y finalmente en Perú evidenciaba que la magnitud de la represión militarizada no era un atributo singular de la situación en que nos encontramos inmersos en Quito aquel mes de </w:t>
+      </w:r>
+      <w:proofErr w:type="gramStart"/>
+      <w:r>
+        <w:rPr>
+          <w:lang w:val="es-PE"/>
+        </w:rPr>
+        <w:t>Octubre</w:t>
+      </w:r>
+      <w:proofErr w:type="gramEnd"/>
+      <w:r>
+        <w:rPr>
+          <w:lang w:val="es-PE"/>
+        </w:rPr>
+        <w:t xml:space="preserve"> de 2019. La significancia internacion</w:t>
+      </w:r>
+      <w:r>
+        <w:rPr>
+          <w:lang w:val="es-PE"/>
+        </w:rPr>
+        <w:t xml:space="preserve">al de estos episodios de insurgencia para el desarrollo de la lucha de clases no solo radica en la urgencia de su </w:t>
       </w:r>
       <w:r>
         <w:rPr>
           <w:b/>
           <w:bCs/>
-          <w:lang w:val="es-PE"/>
-        </w:rPr>
-        <w:t>, por el cual cierta consciencia de clase es determinada por la experiencia de articulación de las vanguardias populares en las luchas contra la clase capitalista y sus estados garantes.*</w:t>
-      </w:r>
-      <w:r>
-        <w:rPr>
-          <w:lang w:val="es-PE"/>
-        </w:rPr>
-        <w:br/>
-        <w:t>La significancia internacional de estos episodios de insurgencia para el desarrollo de la lucha de clases no solo radica en la urgencia de su contexto histórico, sino también en la emulación efectiva de performances de movilización que permiten un avance en la transformación de la lucha política en lucha de clases. Esto es en la formación de la clase y de la lucha común de sus vanguardias contra la clase capitalista en pleno.</w:t>
-      </w:r>
-      <w:r>
-        <w:rPr>
-          <w:lang w:val="es-PE"/>
-        </w:rPr>
-        <w:br/>
-        <w:t>¿Cuál es la significancia internacional del estallido en los Andes para el desarrollo de la lucha de clases?</w:t>
-      </w:r>
-      <w:r>
-        <w:rPr>
-          <w:lang w:val="es-PE"/>
-        </w:rPr>
-        <w:br/>
-      </w:r>
-    </w:p>
-    <w:p>
-      <w:pPr>
-        <w:pStyle w:val="Textoindependiente"/>
-        <w:rPr>
-          <w:lang w:val="es-PE"/>
-        </w:rPr>
-      </w:pPr>
-      <w:r>
-        <w:rPr>
-          <w:lang w:val="es-PE"/>
-        </w:rPr>
-        <w:t>leninIzquierdismoEnfermedadInfantil1978 &gt; ^</w:t>
-      </w:r>
-      <w:proofErr w:type="spellStart"/>
-      <w:r>
-        <w:rPr>
-          <w:lang w:val="es-PE"/>
-        </w:rPr>
-        <w:t>significanciainternacional</w:t>
-      </w:r>
-      <w:proofErr w:type="spellEnd"/>
-    </w:p>
-    <w:p>
-      <w:pPr>
-        <w:pStyle w:val="Textoindependiente"/>
-        <w:rPr>
-          <w:lang w:val="es-PE"/>
-        </w:rPr>
-      </w:pPr>
-      <w:r>
-        <w:rPr>
-          <w:lang w:val="es-PE"/>
-        </w:rPr>
-        <w:br/>
-        <w:t xml:space="preserve">En el desarrollo espontáneo y fragmentado de la movilización de masas se hace urgente la formación del frente único para articular la lucha común de las vanguardias del pueblo organizado contra la reversión autoritaria en los Andes. La estrategia del frente único es señalada por José Carlos Mariátegui como una solución al problema de la organización de la vanguardia del movimiento obrero. Siguiendo la consigna de unidad del proletariado y en pro del desarrollo de su consciencia de clase, Mariátegui (1924) ofrece un programa reivindicativo base para la unidad de la vanguardia del proletariado en formación, fragmentado no solo por la especialización productiva sino </w:t>
-      </w:r>
-      <w:r>
-        <w:rPr>
-          <w:lang w:val="es-PE"/>
-        </w:rPr>
-        <w:lastRenderedPageBreak/>
-        <w:t>también por la diferenciación ideológica y de filiaciones dentro del movimiento popular peruano a inicios del siglo XX. Se trata de “una acción contingente, concreta, práctica”, “actitud solidaria [de clase] ante un problema concreto, ante una necesidad urgente” motivada por la solidaridad de clase de quienes se encuentran comprometidos con el desarrollo del movimiento popular, y en ese sentido se encuentran conscientes de sus deberes históricos y comprometidos con las reivindicaciones comunes, básicas del programa socialista:</w:t>
-      </w:r>
-      <w:r>
-        <w:rPr>
-          <w:lang w:val="es-PE"/>
-        </w:rPr>
-        <w:br/>
-        <w:t>“El movimiento clasista, entre nosotros, es aún muy incipiente, muy limitado, para que pensemos en fraccionarle y escindirle. Antes de que llegue la hora, inevitable acaso, de una división, nos corresponde realizar mucha obra común, mucha labor solidaria. Tenemos que emprender juntos muchas largas jornadas. Nos toca, por ejemplo, suscitar en la mayoría del proletariado peruano, conciencia de clase y sentimiento de clase. Esta faena pertenece por igual a socialistas y sindicalistas, a comunistas y libertarios. Todos tenemos el deber de sembrar gérmenes de renovación y de difundir ideas clasistas. Todos tenemos el deber de alejar al proletariado de las asambleas amarillas y de las falsas ‘instituciones representativas’. Todos tenemos el deber de luchar contra los ataques y las represiones reaccionarias. Todos tenemos el deber de defender la tribuna, la prensa y la organización proletaria. Todos tenemos el deber de sostener las reivindicaciones de la esclavizada y oprimida raza indígena. En el cumplimiento de estos deberes históricos, de estos deberes elementales, se encontrarán y juntarán nuestros caminos, cualquiera que sea nuestra meta última” (Mariátegui 1924).</w:t>
-      </w:r>
-    </w:p>
-    <w:p>
-      <w:pPr>
-        <w:pStyle w:val="Textoindependiente"/>
-        <w:rPr>
-          <w:lang w:val="es-PE"/>
-        </w:rPr>
-      </w:pPr>
-      <w:r>
-        <w:rPr>
-          <w:lang w:val="es-PE"/>
-        </w:rPr>
-        <w:t>, cuyo resultado es el movimiento revolucionario (Lenin 1920, 8).</w:t>
-      </w:r>
-      <w:r>
-        <w:rPr>
-          <w:lang w:val="es-PE"/>
-        </w:rPr>
-        <w:br/>
-        <w:t>Este momento previo a la constitución del partido revolucionario es también de significancia internacional, ciertos elementos de la dinámica de la lucha política son emulados efectivamente en diferentes contextos. No se trata de una repetición, sino más bien de la operación de los mecanismos de reproducción social del pueblo como vida social en subsunción formal y como complemento de la dominación de la clase capitalista transnacional: la lucha.</w:t>
-      </w:r>
-      <w:r>
-        <w:rPr>
-          <w:lang w:val="es-PE"/>
-        </w:rPr>
-        <w:br/>
-      </w:r>
-    </w:p>
-    <w:p>
-      <w:pPr>
-        <w:pStyle w:val="Textoindependiente"/>
-        <w:rPr>
-          <w:lang w:val="es-PE"/>
-        </w:rPr>
-      </w:pPr>
-      <w:r>
-        <w:rPr>
-          <w:lang w:val="es-PE"/>
-        </w:rPr>
-        <w:br/>
-        <w:t>El desarrollo de la lucha de clases es un proceso social que opera como subconjunto de la lucha política, en que la solidaridad de clase entre vanguardias se difunde entre las masas movilizadas. Esa solidaridad expresa una identificación con las víctimas de la represión militarizada. En ese momento, la lucha de clases se está desarrollando, como proceso que crea la misma experiencia del evento de lucha contra el mismo enemigo por parte de diferentes sectores de una misma clase. La escalada de la movilización en ese sentido, puede como no puede tener éxito. El desarrollo de la lucha de clases es un proceso social presente en un subconjunto de aquel, en que la solidaridad de clase entre vanguardias se difunde entre las masas movilizadas. Esa solidaridad expresa, a su vez, una identificación con las víctimas de la represión militarizada.</w:t>
-      </w:r>
-      <w:r>
-        <w:rPr>
-          <w:lang w:val="es-PE"/>
-        </w:rPr>
-        <w:br/>
-        <w:t xml:space="preserve">El desarrollo de la lucha de clases no solo implica el cambio de escala del conflicto </w:t>
-      </w:r>
-      <w:r>
-        <w:rPr>
-          <w:lang w:val="es-PE"/>
-        </w:rPr>
-        <w:t>político,</w:t>
-      </w:r>
-      <w:r>
-        <w:rPr>
-          <w:lang w:val="es-PE"/>
-        </w:rPr>
-        <w:t xml:space="preserve"> sino que las vanguardias actúen definitivamente, estratégicamente contra la </w:t>
-      </w:r>
-      <w:r>
-        <w:rPr>
-          <w:lang w:val="es-PE"/>
-        </w:rPr>
-        <w:lastRenderedPageBreak/>
-        <w:t>clase capitalista. Solo cuando las luchas “localizadas, particularizadas, fragmentadas, atomizadas, despolitizadas”, se convierten en episodios de la lucha de clases, la masividad y el sacrificio de las movilizaciones configura con claridad un antagonismo de clases que se agudiza con la bochornosa actuación del estado como guardián de las ganancias de la clase capitalista transnacional y la dominación imperialista que ejerce sobre las clases subordinadas en los Andes.</w:t>
-      </w:r>
-      <w:r>
-        <w:rPr>
-          <w:lang w:val="es-PE"/>
-        </w:rPr>
-        <w:br/>
-        <w:t xml:space="preserve">“Todos estamos de acuerdo en que nuestra tarea es organizar la lucha de clases del proletariado. «Pero qué es la lucha de clases? Cuando los obreros de una determinada fábrica, de un gremio determinado, inician una lucha contra su patrono, o sus patronos, ¿es eso lucha de clases? No; eso es tan sólo un débil comienzo. La lucha de los obreros se convierte en lucha de clases, sólo cuando los representantes de vanguardia de toda la clase obrera de un país tienen conciencia de la unidad de la clase obrera y emprenden la lucha, no contra un patrono aislado, sino contra </w:t>
-      </w:r>
-      <w:r>
-        <w:rPr>
           <w:i/>
           <w:iCs/>
           <w:lang w:val="es-PE"/>
         </w:rPr>
-        <w:t>toda la clase</w:t>
-      </w:r>
-      <w:r>
-        <w:rPr>
-          <w:lang w:val="es-PE"/>
-        </w:rPr>
-        <w:t xml:space="preserve"> capitalista y contra el gobierno que apoya a esa clase. Sólo cuando cada obrero tiene conciencia de ser parte de toda la clase obrera, cuando en su pequeña lucha cotidiana contra un patrono o un funcionario ve la lucha contra toda la burguesía y contra el gobierno en pleno, sólo entonces su lucha se trasforma en lucha de clases” (Lenin [1899]1958, 213).</w:t>
+        <w:t>contexto histórico</w:t>
+      </w:r>
+      <w:r>
+        <w:rPr>
+          <w:lang w:val="es-PE"/>
+        </w:rPr>
+        <w:t>, sino también en la emulación efectiva de performances de movilización que permiten un avance en la transformación de la lu</w:t>
+      </w:r>
+      <w:r>
+        <w:rPr>
+          <w:lang w:val="es-PE"/>
+        </w:rPr>
+        <w:t>cha política en lucha de clases. Esto es en la formación de la clase y de la lucha común de sus vanguardias contra la clase capitalista en pleno.</w:t>
+      </w:r>
+    </w:p>
+    <w:p>
+      <w:pPr>
+        <w:pStyle w:val="Textoindependiente"/>
+        <w:rPr>
+          <w:lang w:val="es-PE"/>
+        </w:rPr>
+      </w:pPr>
+      <w:r>
+        <w:rPr>
+          <w:lang w:val="es-PE"/>
+        </w:rPr>
+        <w:t>No se trata de una repetición, sino más bien de la operación de los mecanismos de reproducción social del pueb</w:t>
+      </w:r>
+      <w:r>
+        <w:rPr>
+          <w:lang w:val="es-PE"/>
+        </w:rPr>
+        <w:t>lo como vida social en subsunción formal: los mecanismos del proceso de lucha de clases. "[P]</w:t>
+      </w:r>
+      <w:proofErr w:type="spellStart"/>
+      <w:r>
+        <w:rPr>
+          <w:lang w:val="es-PE"/>
+        </w:rPr>
+        <w:t>or</w:t>
+      </w:r>
+      <w:proofErr w:type="spellEnd"/>
+      <w:r>
+        <w:rPr>
+          <w:lang w:val="es-PE"/>
+        </w:rPr>
+        <w:t xml:space="preserve"> significancia internacional me </w:t>
+      </w:r>
+      <w:r>
+        <w:rPr>
+          <w:lang w:val="es-PE"/>
+        </w:rPr>
+        <w:lastRenderedPageBreak/>
+        <w:t>refiero a la significancia internacional o a la inevitabilidad histórica de la repetición a una escala internacional de lo que ha</w:t>
+      </w:r>
+      <w:r>
+        <w:rPr>
+          <w:lang w:val="es-PE"/>
+        </w:rPr>
+        <w:t xml:space="preserve"> tenido lugar aquí, [...] debe admitirse que algunos de los rasgos fundamentales de nuestra revolución poseen tal significancia internacional. [...] Las vanguardias en todo lugar han comprendido esto hace tiempo, aunque en muchos casos no lo han entendido </w:t>
+      </w:r>
+      <w:r>
+        <w:rPr>
+          <w:lang w:val="es-PE"/>
+        </w:rPr>
+        <w:t>tanto como captado, sentido, por su instinto revolucionario de clase" (Lenin [1920]1934, 7).</w:t>
+      </w:r>
+    </w:p>
+    <w:p>
+      <w:pPr>
+        <w:pStyle w:val="Textoindependiente"/>
+        <w:rPr>
+          <w:lang w:val="es-PE"/>
+        </w:rPr>
+      </w:pPr>
+      <w:r>
+        <w:rPr>
+          <w:lang w:val="es-PE"/>
+        </w:rPr>
+        <w:t>La significancia internacional en el sentido de la operación de estos mecanismos presentes en la lucha política en diferentes contextos históricos, es indicativa d</w:t>
+      </w:r>
+      <w:r>
+        <w:rPr>
+          <w:lang w:val="es-PE"/>
+        </w:rPr>
+        <w:t>el desarrollo de la lucha de clases en su fase inicial como estallido revolucionario, pero también de su acontecimiento en los Andes durante un momento crítico para la reconstitución del capitalismo global, esto es, como indicador de la crisis de hegemonía</w:t>
+      </w:r>
+      <w:r>
+        <w:rPr>
+          <w:lang w:val="es-PE"/>
+        </w:rPr>
+        <w:t xml:space="preserve"> estadounidense cuando a escala global la clase capitalista transnacional acelera una nueva fase de expansión material (vía la expansión de la frontera financiera y extractiva) en medio de la escalada del conflicto armado interestatal entre China, Rusia, E</w:t>
+      </w:r>
+      <w:r>
+        <w:rPr>
+          <w:lang w:val="es-PE"/>
+        </w:rPr>
+        <w:t>stados Unidos y sus aliados de la OTAN.</w:t>
+      </w:r>
+    </w:p>
+    <w:p>
+      <w:pPr>
+        <w:pStyle w:val="Textoindependiente"/>
+        <w:rPr>
+          <w:lang w:val="es-PE"/>
+        </w:rPr>
+      </w:pPr>
+      <w:r>
+        <w:rPr>
+          <w:lang w:val="es-PE"/>
+        </w:rPr>
+        <w:t>Si bien la crisis de hegemonía es global, y se expresa con la escalada del conflicto social e interestatal, pareciera que la crisis de hegemonía burguesa al interior de cada uno de estos países se estuviera desarroll</w:t>
+      </w:r>
+      <w:r>
+        <w:rPr>
+          <w:lang w:val="es-PE"/>
+        </w:rPr>
+        <w:t>ando conforme la crisis de hegemonía global se acentúa y conforme la clase capitalista transnacional puja por iniciar una nueva fase de expansión material del circuito de reproducción del capitalismo global. Una muestra de que las crisis políticas internas</w:t>
+      </w:r>
+      <w:r>
+        <w:rPr>
+          <w:lang w:val="es-PE"/>
+        </w:rPr>
+        <w:t xml:space="preserve"> son causadas por crisis globales es la magnitud de la violencia estatal empleada para reprimir las luchas recientes en nuestros países, se muestra que las burguesías domésticas en un contexto de crisis de hegemonía global no son capaces de controlar los p</w:t>
+      </w:r>
+      <w:r>
+        <w:rPr>
+          <w:lang w:val="es-PE"/>
+        </w:rPr>
+        <w:t>oderes facticos de sus regímenes políticos y tienden a militarizar el régimen ya que no pueden seguir gobernando por los medios que lo hacían (democráticos).</w:t>
+      </w:r>
+    </w:p>
+    <w:p>
+      <w:pPr>
+        <w:pStyle w:val="Textoindependiente"/>
+        <w:rPr>
+          <w:lang w:val="es-PE"/>
+        </w:rPr>
+      </w:pPr>
+      <w:proofErr w:type="spellStart"/>
+      <w:r>
+        <w:rPr>
+          <w:lang w:val="es-PE"/>
+        </w:rPr>
+        <w:t>REPRESIón</w:t>
+      </w:r>
+      <w:proofErr w:type="spellEnd"/>
+      <w:r>
+        <w:rPr>
+          <w:lang w:val="es-PE"/>
+        </w:rPr>
+        <w:t>.</w:t>
+      </w:r>
+    </w:p>
+    <w:p>
+      <w:pPr>
+        <w:pStyle w:val="Textoindependiente"/>
+        <w:rPr>
+          <w:lang w:val="es-PE"/>
+        </w:rPr>
+      </w:pPr>
+      <w:proofErr w:type="spellStart"/>
+      <w:r>
+        <w:rPr>
+          <w:lang w:val="es-PE"/>
+        </w:rPr>
+        <w:t>entrentamiento</w:t>
+      </w:r>
+      <w:proofErr w:type="spellEnd"/>
+      <w:r>
+        <w:rPr>
+          <w:lang w:val="es-PE"/>
+        </w:rPr>
+        <w:t xml:space="preserve"> de esta </w:t>
+      </w:r>
+      <w:proofErr w:type="spellStart"/>
+      <w:r>
+        <w:rPr>
+          <w:lang w:val="es-PE"/>
+        </w:rPr>
+        <w:t>represion</w:t>
+      </w:r>
+      <w:proofErr w:type="spellEnd"/>
+      <w:r>
+        <w:rPr>
+          <w:lang w:val="es-PE"/>
+        </w:rPr>
+        <w:t xml:space="preserve"> es el movimiento revolucionario</w:t>
+      </w:r>
+    </w:p>
+    <w:p>
+      <w:pPr>
+        <w:pStyle w:val="Textoindependiente"/>
+        <w:rPr>
+          <w:lang w:val="es-PE"/>
+        </w:rPr>
+      </w:pPr>
+      <w:r>
+        <w:rPr>
+          <w:lang w:val="es-PE"/>
+        </w:rPr>
+        <w:t>cuyo resultado es el m</w:t>
+      </w:r>
+      <w:r>
+        <w:rPr>
+          <w:lang w:val="es-PE"/>
+        </w:rPr>
+        <w:t>ovimiento revolucionario (Lenin 1920, 8).</w:t>
       </w:r>
       <w:r>
         <w:rPr>
           <w:lang w:val="es-PE"/>
         </w:rPr>
         <w:br/>
-        <w:t>Sin embargo, a inicios del siglo XX Lenin escribía para las vanguardias proletarias que dentro de la socialdemocracia estaban conscientes de su capacidad de actuar como clase, más allá de cualquier afiliación, se hace claro en los episodios de lucha de clases que no hay otra forma humana de responder a la violencia estatal contra un pueblo movilizado más que salir en su defensa. La solidaridad de clase en el momento en que nos encontramos se expresa no tanto por la consciencia del proletariado organizado sino por la de su campesinado organizado. Clase social en que se reconocen a las compañeras y compañeros asesinados</w:t>
-      </w:r>
-      <w:r>
-        <w:rPr>
-          <w:lang w:val="es-PE"/>
-        </w:rPr>
-        <w:br/>
-        <w:t>En este punto, la lucha de clases en los Andes se expresa no tanto por la consciencia del proletariado organizado sino por la de su campesinado, asimismo, en el retorno del indio no solo se encuentra la reivindicación del indio y la tierra, sino que evoca al indio revolucionario. Seremos millones, advierte, y efectivamente son millones los que en los Andes sienten contundentemente la verdadera expresión de las condiciones de dominación y explotación capitalista, la represión militarizada ejercida contra las masas movilizadas puso en evidencia al estado en todo su esplendor como garante de la dominación imperialista. La violencia estatal se ejerce sobre campesinos y estudiantes con brutalidad, les siguen en ese tratamiento todos los demás que se le oponen.</w:t>
-      </w:r>
-      <w:r>
-        <w:rPr>
-          <w:lang w:val="es-PE"/>
-        </w:rPr>
-        <w:br/>
-        <w:t xml:space="preserve">La dominación imperialista no puede ser sino jerárquica con las burguesías domésticas, en ese sentido, las fracciones financiera, minera, petrolera y agroexportadora de las burguesías domésticas andinas, dependen de la magnitud del capital circulante en sus correspondientes industrias, dicha magnitud es ofrecida por la clase capitalista transnacional a través de la inversión extranjera directa. El establecimiento de las inversiones de grandes capitalistas en industrias de la región andina está directamente asociado a la abundancia de sus recursos principalmente minerales y petroleros, desde el siglo XVI a la actualidad. Las burguesías mineras imperialistas fueron las primeras en establecerse en nuestra Abya Yala. Así, durante el cuarto ciclo de acumulación sistémica con hegemonía estadounidense iniciado en el </w:t>
+        <w:t>Este momento previo (como en 1905) a la constitución del partido revolucionario es también de significancia internacional, ciertos elementos de la dinámica de la lucha política son emulados efectivamente en diferen</w:t>
+      </w:r>
+      <w:r>
+        <w:rPr>
+          <w:lang w:val="es-PE"/>
+        </w:rPr>
+        <w:t>tes contextos.</w:t>
+      </w:r>
+    </w:p>
+    <w:p>
+      <w:pPr>
+        <w:pStyle w:val="Textoindependiente"/>
+        <w:rPr>
+          <w:lang w:val="es-PE"/>
+        </w:rPr>
+      </w:pPr>
+    </w:p>
+    <w:p>
+      <w:pPr>
+        <w:pStyle w:val="Textoindependiente"/>
+        <w:rPr>
+          <w:lang w:val="es-PE"/>
+        </w:rPr>
+      </w:pPr>
+    </w:p>
+    <w:p>
+      <w:pPr>
+        <w:pStyle w:val="Textoindependiente"/>
+        <w:rPr>
+          <w:lang w:val="es-PE"/>
+        </w:rPr>
+      </w:pPr>
+      <w:r>
+        <w:rPr>
+          <w:lang w:val="es-PE"/>
+        </w:rPr>
+        <w:t xml:space="preserve">¿Cuál es la significancia internacional del estallido en los Andes para el desarrollo de la lucha de </w:t>
+      </w:r>
+      <w:proofErr w:type="gramStart"/>
+      <w:r>
+        <w:rPr>
+          <w:lang w:val="es-PE"/>
+        </w:rPr>
+        <w:t>clases?%</w:t>
+      </w:r>
+      <w:proofErr w:type="gramEnd"/>
+      <w:r>
+        <w:rPr>
+          <w:lang w:val="es-PE"/>
+        </w:rPr>
+        <w:t xml:space="preserve">%  </w:t>
+      </w:r>
+    </w:p>
+    <w:p>
+      <w:pPr>
+        <w:pStyle w:val="Textoindependiente"/>
+        <w:rPr>
+          <w:lang w:val="es-PE"/>
+        </w:rPr>
+      </w:pPr>
+    </w:p>
+    <w:p>
+      <w:pPr>
+        <w:pStyle w:val="Textoindependiente"/>
+        <w:rPr>
+          <w:lang w:val="es-PE"/>
+        </w:rPr>
+      </w:pPr>
+      <w:r>
+        <w:rPr>
+          <w:lang w:val="es-PE"/>
+        </w:rPr>
+        <w:t xml:space="preserve">Hoy tenemos ya una experiencia internacional muy considerable, que demuestra con absoluta claridad que algunos de los rasgos fundamentales de nuestra revolución </w:t>
       </w:r>
       <w:r>
         <w:rPr>
           <w:lang w:val="es-PE"/>
         </w:rPr>
         <w:lastRenderedPageBreak/>
-        <w:t>siglo XX, la minería fue uno de los sectores donde la inversión de capital productivo minero estadounidense se ha concentrado en la región.</w:t>
-      </w:r>
-      <w:r>
-        <w:rPr>
-          <w:lang w:val="es-PE"/>
-        </w:rPr>
-        <w:br/>
-        <w:t>A partir del siglo XXI, el intento de iniciar un quinto ciclo sistémico de acumulación en medio de una aguda crisis de sobreacumulación causó la expansión de la frontera extractiva minera y petrolera con particular énfasis en los Andes. Solo considerando el incremento exponencial de las concesiones mineras, así como de la</w:t>
-      </w:r>
-      <w:r>
-        <w:rPr>
-          <w:lang w:val="es-PE"/>
-        </w:rPr>
-        <w:br/>
+        <w:t xml:space="preserve">tienen una importancia que no es local, o específicamente nacional, o sólo rusa, sino internacional. No hablo aquí de importancia internacional en el sentido amplio de la palabra: no sólo algunos, sino todos los rasgos fundamentales de nuestra revolución, y   de sus rasgos secundarios, tienen importancia internacional en el sentido de sus efectos en todos los países. Hablo de ello en el sentido más restringido de la palabra, entendiendo por importancia internacional la validez internacional o la inevitabilidad histórica de una repetición, en escala internacional, de lo ocurrido en nuestro país. Hay que reconocer que algunos rasgos fundamentales de nuestra revolución tienen esa importancia (Cita a </w:t>
       </w:r>
       <w:proofErr w:type="spellStart"/>
       <w:r>
         <w:rPr>
           <w:lang w:val="es-PE"/>
         </w:rPr>
-        <w:t>La</w:t>
+        <w:t>lenin</w:t>
       </w:r>
       <w:proofErr w:type="spellEnd"/>
       <w:r>
         <w:rPr>
           <w:lang w:val="es-PE"/>
         </w:rPr>
-        <w:t xml:space="preserve"> política de apertura de las instituciones financieras a la inversión extranjera directa en sectores estratégicos de la economía como la minería, y los beneficios que estos acuerdos institucionales adquiridos mediante las organizaciones financieras internacionales</w:t>
-      </w:r>
-      <w:r>
-        <w:rPr>
-          <w:lang w:val="es-PE"/>
-        </w:rPr>
-        <w:br/>
-        <w:t>Más allá de las luchas políticas que cada desafiador realiza por demandas y reivindicaciones específicas, la lucha de clases se desarrolla con la experiencia masiva del antagonismo de clase durante el enfrentamiento directo con el estado como guardián de la clase capitalista. Quedando al desnudo el estado asesino, mercenario de la acumulación capitalista, masacrando al pueblo movilizado en las calles, en ausencia de cualquier mecanismo institucional que ponga límite a la impunidad y el abuso de la autoridad política de la clase capitalista transnacional, la identificación de los rasgos históricos de las hijas e hijos del pueblo asesinados con los del pueblo explotado y dominado, indígenas, cholos, desposeídos, empobrecidos, estudiantes, campesinos, trabajadores es de total reconocimiento, no solo de indignación. Ese reconocimiento de los rasgos y de las formas de lucha política del pueblo, en medio de la experiencia de la represión militarizada, derriban cualquier falsa interpretación que afirme la autonomía relativa del estado.  La reversión autoritaria del régimen expresada con la militarización de la represión ¿Cómo se desarrolla la lucha de clases en los países donde la dominación imperialista exhibe la crisis de hegemonía global? Si bien la crisis de hegemonía es global, y se expresa con la escalada del conflicto social e interestatal, pareciera que la crisis de hegemonía burguesa al interior de cada uno de estos países se estuviera desarrollando conforme la crisis de hegemonía global se acentúa y conforme la clase capitalista transnacional puja por iniciar una nueva fase de expansión material del circuito de reproducción del capitalismo global. Una muestra de que las crisis políticas internas son causadas por crisis globales es la magnitud de la violencia estatal empleada para reprimir las luchas recientes en nuestros países, se muestra que las burguesías domésticas en un contexto de crisis de hegemonía global no son capaces de controlar los poderes facticos de sus regímenes políticos y tienden a militarizar el régimen ya que no pueden seguir gobernando por los medios que lo hacían (democráticos).</w:t>
-      </w:r>
-      <w:r>
-        <w:rPr>
-          <w:lang w:val="es-PE"/>
-        </w:rPr>
-        <w:br/>
-        <w:t>Segundo, el estallido como punto de quiebre en el desarrollo de la lucha política en los Andes, forma parte de la explosión a escala global que representaría en esa metáfora la crisis terminal del sistema capitalista. La crisis de hegemonía y crisis de sobreacumulación</w:t>
-      </w:r>
-      <w:r>
-        <w:rPr>
-          <w:lang w:val="es-PE"/>
-        </w:rPr>
-        <w:br/>
-        <w:t xml:space="preserve">La política de apertura de las instituciones financieras a la inversión extranjera directa en sectores estratégicos de la economía como la minería, y los beneficios que estos acuerdos institucionales adquiridos mediante las organizaciones financieras internacionales, no es posible de aplicarse sin la </w:t>
-      </w:r>
-      <w:r>
-        <w:rPr>
-          <w:lang w:val="es-PE"/>
-        </w:rPr>
-        <w:t>dimensión</w:t>
-      </w:r>
-      <w:r>
-        <w:rPr>
-          <w:lang w:val="es-PE"/>
-        </w:rPr>
-        <w:t xml:space="preserve"> militarizada de la acumulación.</w:t>
-      </w:r>
-      <w:r>
-        <w:rPr>
-          <w:lang w:val="es-PE"/>
-        </w:rPr>
-        <w:br/>
-        <w:t xml:space="preserve">Significancia internacional de los performances de lucha, enfrentamientos de masas </w:t>
+        <w:t>)</w:t>
+      </w:r>
+    </w:p>
+    <w:p>
+      <w:pPr>
+        <w:pStyle w:val="Textoindependiente"/>
+        <w:rPr>
+          <w:lang w:val="es-PE"/>
+        </w:rPr>
+      </w:pPr>
+      <w:r>
+        <w:rPr>
+          <w:lang w:val="es-PE"/>
+        </w:rPr>
+        <w:t xml:space="preserve">Segundo, el estallido como punto de quiebre en el desarrollo de la lucha política en los Andes, forma parte de la explosión a escala global que representaría en esa metáfora la crisis terminal del sistema capitalista. La crisis de hegemonía y crisis de sobreacumulación  </w:t>
+      </w:r>
+    </w:p>
+    <w:p>
+      <w:pPr>
+        <w:pStyle w:val="Textoindependiente"/>
+        <w:rPr>
+          <w:lang w:val="es-PE"/>
+        </w:rPr>
+      </w:pPr>
+    </w:p>
+    <w:p>
+      <w:pPr>
+        <w:pStyle w:val="Textoindependiente"/>
+        <w:rPr>
+          <w:lang w:val="es-PE"/>
+        </w:rPr>
+      </w:pPr>
+      <w:r>
+        <w:rPr>
+          <w:lang w:val="es-PE"/>
+        </w:rPr>
+        <w:t>La política de apertura de las instituciones financieras a la inversión extranjera directa en sectores estratégicos de la economía como la minería, y los beneficios que estos acuerdos institucionales adquiridos mediante las organizaciones financieras internacionales, no es posible de aplicarse sin la dimensión militarizada de la acumulación.</w:t>
+      </w:r>
+    </w:p>
+    <w:p>
+      <w:pPr>
+        <w:pStyle w:val="Textoindependiente"/>
+        <w:rPr>
+          <w:lang w:val="es-PE"/>
+        </w:rPr>
+      </w:pPr>
+    </w:p>
+    <w:p>
+      <w:pPr>
+        <w:pStyle w:val="Textoindependiente"/>
+        <w:rPr>
+          <w:lang w:val="es-PE"/>
+        </w:rPr>
+      </w:pPr>
+      <w:r>
+        <w:rPr>
+          <w:lang w:val="es-PE"/>
+        </w:rPr>
+        <w:t>Significancia internacional de los performances de lucha, enfrentamientos de masas campesinas frente a la violencia estatal abierta en el siglo XXI: uso de escudos y primeras líneas en la lucha anti-minera fueron usados en el asedio a los centros de poder político de la dominación imperialista. La difusión de dichos performances se explica porque el campesinado viene de un proceso de lucha contra la burguesía minera imperialista que avanza y encrudece a partir del siglo XXI con la expansión de la frontera extractiva minera, correspondiente al incremento exponencial de las concesiones mineras y de la inversión extranjera directa, no más que del 10% de las rentas estatales, pero alrededor del 60% de las exportaciones totales</w:t>
+      </w:r>
+    </w:p>
+    <w:p>
+      <w:pPr>
+        <w:pStyle w:val="Textoindependiente"/>
+        <w:rPr>
+          <w:lang w:val="es-PE"/>
+        </w:rPr>
+      </w:pPr>
+    </w:p>
+    <w:p>
+      <w:pPr>
+        <w:pStyle w:val="Textoindependiente"/>
+        <w:rPr>
+          <w:lang w:val="es-PE"/>
+        </w:rPr>
+      </w:pPr>
+      <w:r>
+        <w:rPr>
+          <w:lang w:val="es-PE"/>
+        </w:rPr>
+        <w:t xml:space="preserve">Así se expresó en Perú desde inicios del siglo XXI la escalada de la lucha política, mediante el desarrollo de campañas sostenidas de lucha emblemáticas como las de </w:t>
+      </w:r>
+      <w:proofErr w:type="spellStart"/>
+      <w:r>
+        <w:rPr>
+          <w:lang w:val="es-PE"/>
+        </w:rPr>
+        <w:t>Tambogrande</w:t>
+      </w:r>
+      <w:proofErr w:type="spellEnd"/>
+      <w:r>
+        <w:rPr>
+          <w:lang w:val="es-PE"/>
+        </w:rPr>
+        <w:t xml:space="preserve">, </w:t>
+      </w:r>
+      <w:proofErr w:type="spellStart"/>
+      <w:r>
+        <w:rPr>
+          <w:lang w:val="es-PE"/>
+        </w:rPr>
+        <w:t>Quilish</w:t>
+      </w:r>
+      <w:proofErr w:type="spellEnd"/>
+      <w:r>
+        <w:rPr>
+          <w:lang w:val="es-PE"/>
+        </w:rPr>
+        <w:t xml:space="preserve">, Conga, Tía María, el </w:t>
+      </w:r>
+      <w:proofErr w:type="spellStart"/>
+      <w:r>
+        <w:rPr>
+          <w:lang w:val="es-PE"/>
+        </w:rPr>
+        <w:t>Aymarazo</w:t>
+      </w:r>
+      <w:proofErr w:type="spellEnd"/>
+      <w:r>
+        <w:rPr>
+          <w:lang w:val="es-PE"/>
+        </w:rPr>
+        <w:t>, las Bambas, así como la</w:t>
+      </w:r>
+      <w:r>
+        <w:rPr>
+          <w:lang w:val="es-PE"/>
+        </w:rPr>
+        <w:t xml:space="preserve">s protestas espontáneas a escala nacional contra el golpe de estado dado por el Congreso ya coordinado por el </w:t>
+      </w:r>
+      <w:proofErr w:type="spellStart"/>
+      <w:r>
+        <w:rPr>
+          <w:lang w:val="es-PE"/>
+        </w:rPr>
+        <w:t>fujimontesinismo</w:t>
+      </w:r>
+      <w:proofErr w:type="spellEnd"/>
+      <w:r>
+        <w:rPr>
+          <w:lang w:val="es-PE"/>
+        </w:rPr>
+        <w:t xml:space="preserve"> que en noviembre de 2020 nombrara a Manuel Merino como presidente, y las protestas de los agricultores del norte y sur contra la </w:t>
+      </w:r>
+      <w:r>
+        <w:rPr>
+          <w:lang w:val="es-PE"/>
+        </w:rPr>
+        <w:t>explotación de la oligarquía agroexportadora; episodios de lucha con que fueron forjándose las nuevas organizaciones y vanguardias del movimiento popular que hoy valientemente se encuentran con los estudiantes, profesores, sindicatos de trabajadores y masa</w:t>
+      </w:r>
+      <w:r>
+        <w:rPr>
+          <w:lang w:val="es-PE"/>
+        </w:rPr>
+        <w:t xml:space="preserve">s indignadas combativas en la lucha contra la </w:t>
       </w:r>
       <w:r>
         <w:rPr>
           <w:lang w:val="es-PE"/>
         </w:rPr>
         <w:lastRenderedPageBreak/>
-        <w:t xml:space="preserve">campesinas frente a la violencia estatal abierta en el siglo XXI: uso de escudos y primeras </w:t>
-      </w:r>
-      <w:r>
-        <w:rPr>
-          <w:lang w:val="es-PE"/>
-        </w:rPr>
-        <w:t>líneas</w:t>
-      </w:r>
-      <w:r>
-        <w:rPr>
-          <w:lang w:val="es-PE"/>
-        </w:rPr>
-        <w:t xml:space="preserve"> en la lucha </w:t>
-      </w:r>
-      <w:r>
-        <w:rPr>
-          <w:lang w:val="es-PE"/>
-        </w:rPr>
-        <w:t>anti-minera</w:t>
-      </w:r>
-      <w:r>
-        <w:rPr>
-          <w:lang w:val="es-PE"/>
-        </w:rPr>
-        <w:t xml:space="preserve"> fueron usados en el asedio a los centros de poder político de la dominación imperialista. La difusión de dichos performances se explica porque el campesinado viene de un proceso de lucha contra la burguesía minera imperialista que avanza y encrudece a partir del siglo XXI con la expansión de la frontera extractiva minera, correspondiente al incremento exponencial de las concesiones mineras y de la inversión extranjera directa, no más que del 10% de las rentas </w:t>
-      </w:r>
-      <w:r>
-        <w:rPr>
-          <w:lang w:val="es-PE"/>
-        </w:rPr>
-        <w:t>estatales,</w:t>
-      </w:r>
-      <w:r>
-        <w:rPr>
-          <w:lang w:val="es-PE"/>
-        </w:rPr>
-        <w:t xml:space="preserve"> pero alrededor del 60% de las exportaciones totales</w:t>
-      </w:r>
-    </w:p>
-    <w:p>
-      <w:pPr>
-        <w:pStyle w:val="Textoindependiente"/>
-        <w:rPr>
-          <w:lang w:val="es-PE"/>
-        </w:rPr>
-      </w:pPr>
-      <w:r>
-        <w:rPr>
-          <w:lang w:val="es-PE"/>
-        </w:rPr>
-        <w:t>Asimismo,</w:t>
-      </w:r>
-      <w:r>
-        <w:rPr>
-          <w:lang w:val="es-PE"/>
-        </w:rPr>
-        <w:br/>
-        <w:t>El proletariado puede desarrollar la lucha política por mayores salarios o pensiones, incluso mejores condiciones de vida y trabajo, y tener éxito en su reproducción social como tal, como fuerza de trabajo usada para la producción y acumulación de ganancias por una clase explotadora. El sentido liberador de la lucha de clases en que toma forma la idea de revolución, implica avanzar de una lucha política efectiva a una lucha de clases.</w:t>
-      </w:r>
-    </w:p>
-    <w:p>
-      <w:r>
-        <w:pict w14:anchorId="570E95C1">
-          <v:rect id="_x0000_i1025" style="width:0;height:1.5pt" o:hralign="center" o:hrstd="t" o:hr="t"/>
+        <w:t xml:space="preserve">dictadura encubierta por Dina </w:t>
+      </w:r>
+      <w:proofErr w:type="spellStart"/>
+      <w:r>
+        <w:rPr>
+          <w:lang w:val="es-PE"/>
+        </w:rPr>
+        <w:t>Boluarte</w:t>
+      </w:r>
+      <w:proofErr w:type="spellEnd"/>
+      <w:r>
+        <w:rPr>
+          <w:lang w:val="es-PE"/>
+        </w:rPr>
+        <w:t xml:space="preserve"> y el primer ministro </w:t>
+      </w:r>
+      <w:proofErr w:type="spellStart"/>
+      <w:r>
+        <w:rPr>
+          <w:lang w:val="es-PE"/>
+        </w:rPr>
+        <w:t>fujimontesinista</w:t>
+      </w:r>
+      <w:proofErr w:type="spellEnd"/>
+      <w:r>
+        <w:rPr>
+          <w:lang w:val="es-PE"/>
+        </w:rPr>
+        <w:t xml:space="preserve"> Alberto </w:t>
+      </w:r>
+      <w:proofErr w:type="spellStart"/>
+      <w:r>
+        <w:rPr>
+          <w:lang w:val="es-PE"/>
+        </w:rPr>
+        <w:t>Otarola</w:t>
+      </w:r>
+      <w:proofErr w:type="spellEnd"/>
+      <w:r>
+        <w:rPr>
+          <w:lang w:val="es-PE"/>
+        </w:rPr>
+        <w:t>.</w:t>
+      </w:r>
+    </w:p>
+    <w:p>
+      <w:pPr>
+        <w:pStyle w:val="Textoindependiente"/>
+        <w:rPr>
+          <w:lang w:val="es-PE"/>
+        </w:rPr>
+      </w:pPr>
+      <w:r>
+        <w:rPr>
+          <w:lang w:val="es-PE"/>
+        </w:rPr>
+        <w:t>En el desarrollo espontáneo y fragmentado de la movilización de masas se hace urgente la formación del frente único</w:t>
+      </w:r>
+      <w:r>
+        <w:rPr>
+          <w:rStyle w:val="Refdenotaalpie"/>
+          <w:lang w:val="es-PE"/>
+        </w:rPr>
+        <w:footnoteReference w:id="2"/>
+      </w:r>
+      <w:r>
+        <w:rPr>
+          <w:lang w:val="es-PE"/>
+        </w:rPr>
+        <w:t xml:space="preserve"> </w:t>
+      </w:r>
+      <w:r>
+        <w:rPr>
+          <w:lang w:val="es-PE"/>
+        </w:rPr>
+        <w:t>para articular la lucha común de las vanguardias del pueblo organizado contra la reversión autoritaria en los Andes.</w:t>
+      </w:r>
+    </w:p>
+    <w:p>
+      <w:pPr>
+        <w:pStyle w:val="Textoindependiente"/>
+        <w:rPr>
+          <w:lang w:val="es-PE"/>
+        </w:rPr>
+      </w:pPr>
+      <w:r>
+        <w:rPr>
+          <w:lang w:val="es-PE"/>
+        </w:rPr>
+        <w:t>Significancia internacional de los performances de lucha, enfrentamientos de masas campesinas frente a la violencia estatal abierta en el siglo XXI: uso d</w:t>
+      </w:r>
+      <w:r>
+        <w:rPr>
+          <w:lang w:val="es-PE"/>
+        </w:rPr>
+        <w:t>e escudos y primeras líneas en la lucha anti-minera fueron usados en el asedio a los centros de poder político de la dominación imperialista. La difusión de dichos performances se explica porque el campesinado viene de un proceso de lucha contra la burgues</w:t>
+      </w:r>
+      <w:r>
+        <w:rPr>
+          <w:lang w:val="es-PE"/>
+        </w:rPr>
+        <w:t>ía minera imperialista que avanza y encrudece a partir del siglo XXI con la expansión de la frontera extractiva minera, correspondiente al incremento exponencial de las concesiones mineras y de la inversión extranjera directa, no más que del 10% de las ren</w:t>
+      </w:r>
+      <w:r>
+        <w:rPr>
+          <w:lang w:val="es-PE"/>
+        </w:rPr>
+        <w:t>tas estatales, pero alrededor del 60% de las exportaciones totales</w:t>
+      </w:r>
+    </w:p>
+    <w:p>
+      <w:pPr>
+        <w:pStyle w:val="Textoindependiente"/>
+        <w:rPr>
+          <w:lang w:val="es-PE"/>
+        </w:rPr>
+      </w:pPr>
+      <w:r>
+        <w:rPr>
+          <w:lang w:val="es-PE"/>
+        </w:rPr>
+        <w:lastRenderedPageBreak/>
+        <w:t>El desarrollo de la lucha de clases es también un proceso social que opera como subconjunto de la lucha política, en que la solidaridad de clase entre vanguardias se difunde entre las masas</w:t>
+      </w:r>
+      <w:r>
+        <w:rPr>
+          <w:lang w:val="es-PE"/>
+        </w:rPr>
+        <w:t xml:space="preserve"> movilizadas. Esa solidaridad expresa una identificación con las víctimas de la represión militarizada. El reconocimiento de los rasgos y de las formas de lucha política del pueblo (performances), en medio de la experiencia de la represión militarizada, de</w:t>
+      </w:r>
+      <w:r>
+        <w:rPr>
+          <w:lang w:val="es-PE"/>
+        </w:rPr>
+        <w:t>rriban cualquier falsa interpretación que afirme la autonomía relativa del estado.</w:t>
+      </w:r>
+    </w:p>
+    <w:p>
+      <w:pPr>
+        <w:pStyle w:val="Textoindependiente"/>
+        <w:rPr>
+          <w:lang w:val="es-PE"/>
+        </w:rPr>
+      </w:pPr>
+      <w:r>
+        <w:rPr>
+          <w:lang w:val="es-PE"/>
+        </w:rPr>
+        <w:t>En ese momento, la lucha de clases se está desarrollando, como proceso que crea la misma experiencia del evento de lucha contra el mismo enemigo por parte de diferentes sect</w:t>
+      </w:r>
+      <w:r>
+        <w:rPr>
+          <w:lang w:val="es-PE"/>
+        </w:rPr>
+        <w:t>ores de una misma clase. La escalada de la movilización en ese sentido, puede como no puede tener éxito. El desarrollo de la lucha de clases es un proceso social presente en un subconjunto de aquel, en que la solidaridad de clase entre vanguardias se difun</w:t>
+      </w:r>
+      <w:r>
+        <w:rPr>
+          <w:lang w:val="es-PE"/>
+        </w:rPr>
+        <w:t>de entre las masas movilizadas. Esa solidaridad expresa, a su vez, una identificación con las víctimas de la represión militarizada.</w:t>
+      </w:r>
+    </w:p>
+    <w:p>
+      <w:pPr>
+        <w:pStyle w:val="Textoindependiente"/>
+        <w:rPr>
+          <w:lang w:val="es-PE"/>
+        </w:rPr>
+      </w:pPr>
+      <w:r>
+        <w:rPr>
+          <w:lang w:val="es-PE"/>
+        </w:rPr>
+        <w:t>, la identificación de los rasgos históricos de las hijas e hijos del pueblo asesinados con los del pueblo explotado y domi</w:t>
+      </w:r>
+      <w:r>
+        <w:rPr>
+          <w:lang w:val="es-PE"/>
+        </w:rPr>
+        <w:t>nado, indígenas, cholos, desposeídos, empobrecidos, estudiantes, campesinos, trabajadores es de total reconocimiento, no solo de indignación.</w:t>
+      </w:r>
+    </w:p>
+    <w:p>
+      <w:pPr>
+        <w:pStyle w:val="Textoindependiente"/>
+        <w:rPr>
+          <w:lang w:val="es-PE"/>
+        </w:rPr>
+      </w:pPr>
+      <w:r>
+        <w:rPr>
+          <w:lang w:val="es-PE"/>
+        </w:rPr>
+        <w:t>La reversión autoritaria del régimen expresada con la militarización de la represión.</w:t>
+      </w:r>
+    </w:p>
+    <w:p>
+      <w:pPr>
+        <w:pStyle w:val="Textoindependiente"/>
+        <w:rPr>
+          <w:lang w:val="es-PE"/>
+        </w:rPr>
+      </w:pPr>
+      <w:r>
+        <w:rPr>
+          <w:lang w:val="es-PE"/>
+        </w:rPr>
+        <w:t>, ciertos elementos de la di</w:t>
+      </w:r>
+      <w:r>
+        <w:rPr>
+          <w:lang w:val="es-PE"/>
+        </w:rPr>
+        <w:t xml:space="preserve">námica de la lucha política son emulados efectivamente en diferentes contextos. No se trata de una repetición, sino más bien de la operación de los mecanismos de reproducción social del pueblo como vida social en subsunción formal y como complemento de la </w:t>
+      </w:r>
+      <w:r>
+        <w:rPr>
+          <w:lang w:val="es-PE"/>
+        </w:rPr>
+        <w:t>dominación de la clase capitalista transnacional: la lucha.</w:t>
+      </w:r>
+    </w:p>
+    <w:p>
+      <w:pPr>
+        <w:pStyle w:val="Textoindependiente"/>
+        <w:rPr>
+          <w:lang w:val="es-PE"/>
+        </w:rPr>
+      </w:pPr>
+      <w:r>
+        <w:rPr>
+          <w:lang w:val="es-PE"/>
+        </w:rPr>
+        <w:t>Tanto los performances como las demandas, reivindicaciones, formaciones sociales, organizaciones populares e identidades que se configuran con el estallido en los Andes corresponden a una lucha de</w:t>
+      </w:r>
+      <w:r>
+        <w:rPr>
+          <w:lang w:val="es-PE"/>
+        </w:rPr>
+        <w:t xml:space="preserve"> clases defensiva, rasgo compartido también con el desarrollo simultáneo de la lucha de clases en Francia en la actualidad. En ese sentido, cabe citar al sociólogo marxista Kevin Anderson al respecto, cuando sugiere optimistamente:</w:t>
+      </w:r>
+    </w:p>
+    <w:p>
+      <w:pPr>
+        <w:pStyle w:val="Textoindependiente"/>
+        <w:rPr>
+          <w:lang w:val="es-PE"/>
+        </w:rPr>
+      </w:pPr>
+      <w:r>
+        <w:rPr>
+          <w:lang w:val="es-PE"/>
+        </w:rPr>
+        <w:t>"Dicho esto, incluso una</w:t>
+      </w:r>
+      <w:r>
+        <w:rPr>
+          <w:lang w:val="es-PE"/>
+        </w:rPr>
+        <w:t xml:space="preserve"> lucha defensiva puede transformarse en una ofensiva revolucionaria. Es por eso que los medios burgueses globales, [t]</w:t>
+      </w:r>
+      <w:proofErr w:type="spellStart"/>
+      <w:r>
+        <w:rPr>
+          <w:lang w:val="es-PE"/>
+        </w:rPr>
+        <w:t>emen</w:t>
+      </w:r>
+      <w:proofErr w:type="spellEnd"/>
+      <w:r>
+        <w:rPr>
+          <w:lang w:val="es-PE"/>
+        </w:rPr>
+        <w:t xml:space="preserve"> que esto pueda convertirse en un verdadero desafío al neoliberalismo, si no al propio capitalismo. Observan el resurgimiento del trab</w:t>
+      </w:r>
+      <w:r>
+        <w:rPr>
+          <w:lang w:val="es-PE"/>
+        </w:rPr>
+        <w:t>ajo en todo el mundo industrialmente desarrollado, los levantamientos en curso de los negros y otras personas de color e indígenas, la profunda ira y las movilizaciones de las mujeres y de las personas LBGTQ, especialmente las personas trans, y la renovada</w:t>
+      </w:r>
+      <w:r>
+        <w:rPr>
+          <w:lang w:val="es-PE"/>
+        </w:rPr>
+        <w:t xml:space="preserve"> militancia del movimiento ecologista. Y temen, con razón, que Francia, como en el pasado, pueda convertirse en el detonador de una lucha más amplia contra el propio capitalismo." (Anderson 2023).</w:t>
+      </w:r>
+    </w:p>
+    <w:p>
+      <w:pPr>
+        <w:pStyle w:val="Textoindependiente"/>
+        <w:rPr>
+          <w:lang w:val="es-PE"/>
+        </w:rPr>
+      </w:pPr>
+      <w:r>
+        <w:rPr>
+          <w:lang w:val="es-PE"/>
+        </w:rPr>
+        <w:t xml:space="preserve">En Perú, Ecuador, Chile, Francia o Nicaragua, en donde sea </w:t>
+      </w:r>
+      <w:r>
+        <w:rPr>
+          <w:lang w:val="es-PE"/>
+        </w:rPr>
+        <w:t xml:space="preserve">que los pueblos amanecen en primavera, se oye, se siente el estallido. Truenan como enormes rocas que hacen </w:t>
+      </w:r>
+      <w:r>
+        <w:rPr>
+          <w:lang w:val="es-PE"/>
+        </w:rPr>
+        <w:lastRenderedPageBreak/>
+        <w:t>temblar a la clase capitalista en el mundo entero, abriendo los surcos de nuestro mundo nuevo.</w:t>
+      </w:r>
+    </w:p>
+    <w:p>
+      <w:pPr>
+        <w:pStyle w:val="Textoindependiente"/>
+        <w:rPr>
+          <w:lang w:val="es-PE"/>
+        </w:rPr>
+      </w:pPr>
+      <w:r>
+        <w:rPr>
+          <w:lang w:val="es-PE"/>
+        </w:rPr>
+        <w:t xml:space="preserve">¿Escucharon? Es el sonido de su mundo derrumbándose, </w:t>
+      </w:r>
+      <w:r>
+        <w:rPr>
+          <w:lang w:val="es-PE"/>
+        </w:rPr>
+        <w:t>es el del nuestro resurgiendo.</w:t>
+      </w:r>
+    </w:p>
+    <w:p>
+      <w:r>
+        <w:pict w14:anchorId="24856731">
+          <v:rect id="_x0000_i1027" style="width:0;height:1.5pt" o:hralign="center" o:hrstd="t" o:hr="t"/>
         </w:pict>
       </w:r>
     </w:p>
@@ -916,7 +1951,7 @@
         </w:rPr>
         <w:t xml:space="preserve">1(#_ftnref1) Esta primera sección se publicó el 13 de enero de 2023 en: </w:t>
       </w:r>
-      <w:hyperlink r:id="rId7">
+      <w:hyperlink r:id="rId8">
         <w:r>
           <w:rPr>
             <w:rStyle w:val="Hipervnculo"/>
@@ -934,8 +1969,8 @@
     </w:p>
     <w:p>
       <w:r>
-        <w:pict w14:anchorId="659402F9">
-          <v:rect id="_x0000_i1026" style="width:0;height:1.5pt" o:hralign="center" o:hrstd="t" o:hr="t"/>
+        <w:pict w14:anchorId="2CD49A52">
+          <v:rect id="_x0000_i1028" style="width:0;height:1.5pt" o:hralign="center" o:hrstd="t" o:hr="t"/>
         </w:pict>
       </w:r>
     </w:p>
@@ -950,7 +1985,83 @@
         <w:rPr>
           <w:lang w:val="es-PE"/>
         </w:rPr>
-        <w:t> 51(#_msoanchor_1)Podría ser un pie de página</w:t>
+        <w:t> 51(#_msoanchor_</w:t>
+      </w:r>
+      <w:proofErr w:type="gramStart"/>
+      <w:r>
+        <w:rPr>
+          <w:lang w:val="es-PE"/>
+        </w:rPr>
+        <w:t>1)Podría</w:t>
+      </w:r>
+      <w:proofErr w:type="gramEnd"/>
+      <w:r>
+        <w:rPr>
+          <w:lang w:val="es-PE"/>
+        </w:rPr>
+        <w:t xml:space="preserve"> ser un pie de página</w:t>
+      </w:r>
+    </w:p>
+    <w:p>
+      <w:pPr>
+        <w:pStyle w:val="Textoindependiente"/>
+        <w:rPr>
+          <w:lang w:val="es-PE"/>
+        </w:rPr>
+      </w:pPr>
+      <w:r>
+        <w:rPr>
+          <w:lang w:val="es-PE"/>
+        </w:rPr>
+        <w:t>Figura 1.</w:t>
+      </w:r>
+      <w:r>
+        <w:rPr>
+          <w:lang w:val="es-PE"/>
+        </w:rPr>
+        <w:t xml:space="preserve"> Documento suscrito por la Oficina de Prensa e Imagen Institucional del Comando Conjunto de las Fuerzas Armadas y la Dirección de Comunicación e Imagen Institucional denominado "Comunicado Comando Conjunto de las Fuerzas Armadas y Policía Nacional del Perú</w:t>
+      </w:r>
+      <w:r>
+        <w:rPr>
+          <w:lang w:val="es-PE"/>
+        </w:rPr>
+        <w:t xml:space="preserve"> </w:t>
+      </w:r>
+      <w:proofErr w:type="spellStart"/>
+      <w:r>
+        <w:rPr>
+          <w:lang w:val="es-PE"/>
+        </w:rPr>
+        <w:t>N°</w:t>
+      </w:r>
+      <w:proofErr w:type="spellEnd"/>
+      <w:r>
+        <w:rPr>
+          <w:lang w:val="es-PE"/>
+        </w:rPr>
+        <w:t xml:space="preserve"> 001-2022-CCFFAA-PNP".</w:t>
+      </w:r>
+    </w:p>
+    <w:p>
+      <w:pPr>
+        <w:pStyle w:val="Textoindependiente"/>
+        <w:rPr>
+          <w:lang w:val="es-PE"/>
+        </w:rPr>
+      </w:pPr>
+      <w:proofErr w:type="spellStart"/>
+      <w:r>
+        <w:rPr>
+          <w:lang w:val="es-PE"/>
+        </w:rPr>
+        <w:t>Recomendacion</w:t>
+      </w:r>
+      <w:proofErr w:type="spellEnd"/>
+      <w:r>
+        <w:rPr>
+          <w:lang w:val="es-PE"/>
+        </w:rPr>
+        <w:t xml:space="preserve"> de que al final del libro vayan las figuras, incluyendo fotos y demás.</w:t>
       </w:r>
       <w:bookmarkEnd w:id="2"/>
     </w:p>
@@ -1004,6 +2115,74 @@
       </w:r>
     </w:p>
   </w:footnote>
+  <w:footnote w:id="1">
+    <w:p>
+      <w:pPr>
+        <w:pStyle w:val="Textonotapie"/>
+        <w:rPr>
+          <w:lang w:val="es-PE"/>
+        </w:rPr>
+      </w:pPr>
+      <w:r>
+        <w:rPr>
+          <w:rStyle w:val="Refdenotaalpie"/>
+        </w:rPr>
+        <w:footnoteRef/>
+      </w:r>
+      <w:r>
+        <w:rPr>
+          <w:lang w:val="es-PE"/>
+        </w:rPr>
+        <w:t xml:space="preserve"> </w:t>
+      </w:r>
+      <w:r>
+        <w:rPr>
+          <w:lang w:val="es-PE"/>
+        </w:rPr>
+        <w:t>A diferencia del salario, como mecanismo de reproducción capitalista de la fuerza de trabajo, por el cual una cantidad arbitraria de las ganancias acumuladas por el capitalista retorna en forma de capital variable, como salario, al trabajador explotado en la producción de las mercancías que ese capitalista vende, de tal forma que con cada repetición de dicho circuito incrementa su escala de acumulación; los mecanismos de la lucha política que desarrollan el proceso de lucha de clases se realizan consciente y antagónicamente contra la operación de los mecanismos de reproducción capitalista.</w:t>
+      </w:r>
+    </w:p>
+  </w:footnote>
+  <w:footnote w:id="2">
+    <w:p>
+      <w:pPr>
+        <w:pStyle w:val="Textonotapie"/>
+        <w:rPr>
+          <w:lang w:val="es-PE"/>
+        </w:rPr>
+      </w:pPr>
+      <w:r>
+        <w:rPr>
+          <w:rStyle w:val="Refdenotaalpie"/>
+        </w:rPr>
+        <w:footnoteRef/>
+      </w:r>
+      <w:r>
+        <w:rPr>
+          <w:lang w:val="es-PE"/>
+        </w:rPr>
+        <w:t xml:space="preserve"> </w:t>
+      </w:r>
+      <w:r>
+        <w:rPr>
+          <w:lang w:val="es-PE"/>
+        </w:rPr>
+        <w:t>La estrategia del frente único es señalada por José Carlos Mariátegui como una solución al problema de la organización de la vanguardia del movimiento obrero. Siguiendo la consigna de unidad del proletariado y en pro del desarrollo de su consciencia de clase, Mariátegui (1924) construyó un programa reivindicativo base para la unidad de la vanguardia del proletariado en formación, fragmentado no solo por la especialización productiva sino también por la diferenciación ideológica y de filiaciones dentro del movimiento popular peruano a inicios del siglo XX. Se trata de “una acción contingente, concreta, práctica”, “actitud solidaria [de clase] ante un problema concreto, ante una necesidad urgente” motivada por la solidaridad de clase de quienes se encuentran comprometidos con el desarrollo del movimiento popular, y en ese sentido se encuentran conscientes de sus deberes históricos y comprometidos con las reivindicaciones comunes, básicas del programa socialista:</w:t>
+      </w:r>
+      <w:r>
+        <w:rPr>
+          <w:lang w:val="es-PE"/>
+        </w:rPr>
+        <w:t xml:space="preserve"> </w:t>
+      </w:r>
+      <w:r>
+        <w:rPr>
+          <w:lang w:val="es-PE"/>
+        </w:rPr>
+        <w:t>“El movimiento clasista, entre nosotros, es aún muy incipiente, muy limitado, para que pensemos en fraccionarle y escindirle. Antes de que llegue la hora, inevitable acaso, de una división, nos corresponde realizar mucha obra común, mucha labor solidaria. Tenemos que emprender juntos muchas largas jornadas. Nos toca, por ejemplo, suscitar en la mayoría del proletariado peruano, conciencia de clase y sentimiento de clase. Esta faena pertenece por igual a socialistas y sindicalistas, a comunistas y libertarios. Todos tenemos el deber de sembrar gérmenes de renovación y de difundir ideas clasistas. Todos tenemos el deber de alejar al proletariado de las asambleas amarillas y de las falsas ‘instituciones representativas’. Todos tenemos el deber de luchar contra los ataques y las represiones reaccionarias. Todos tenemos el deber de defender la tribuna, la prensa y la organización proletaria. Todos tenemos el deber de sostener las reivindicaciones de la esclavizada y oprimida raza indígena. En el cumplimiento de estos deberes históricos, de estos deberes elementales, se encontrarán y juntarán nuestros caminos, cualquiera que sea nuestra meta última” (Mariátegui 1924).</w:t>
+      </w:r>
+    </w:p>
+  </w:footnote>
 </w:footnotes>
 </file>
 
@@ -1012,7 +2191,7 @@
   <w:abstractNum w:abstractNumId="0" w15:restartNumberingAfterBreak="0">
     <w:nsid w:val="0000A990"/>
     <w:multiLevelType w:val="multilevel"/>
-    <w:tmpl w:val="BC7A065C"/>
+    <w:tmpl w:val="9D0C4BF6"/>
     <w:lvl w:ilvl="0">
       <w:numFmt w:val="bullet"/>
       <w:lvlText w:val=" "/>
@@ -1247,13 +2426,6 @@
     <w:lsdException w:name="Placeholder Text" w:semiHidden="1"/>
     <w:lsdException w:name="Light Shading"/>
     <w:lsdException w:name="Light List"/>
-    <w:lsdException w:name="Light Grid"/>
-    <w:lsdException w:name="Medium Shading 1"/>
-    <w:lsdException w:name="Medium Shading 2"/>
-    <w:lsdException w:name="Medium List 1"/>
-    <w:lsdException w:name="Medium List 2"/>
-    <w:lsdException w:name="Medium Grid 1"/>
-    <w:lsdException w:name="Medium Grid 2"/>
     <w:lsdException w:name="Medium Grid 3"/>
     <w:lsdException w:name="Dark List"/>
     <w:lsdException w:name="Colorful Shading"/>
@@ -1457,7 +2629,6 @@
     <w:next w:val="Textoindependiente"/>
     <w:uiPriority w:val="9"/>
     <w:qFormat/>
-    <w:rsid w:val="00A96C48"/>
     <w:pPr>
       <w:keepNext/>
       <w:keepLines/>
@@ -1468,7 +2639,7 @@
       <w:rFonts w:asciiTheme="majorHAnsi" w:eastAsiaTheme="majorEastAsia" w:hAnsiTheme="majorHAnsi" w:cstheme="majorBidi"/>
       <w:b/>
       <w:bCs/>
-      <w:color w:val="C00000"/>
+      <w:color w:val="4F81BD" w:themeColor="accent1"/>
       <w:sz w:val="32"/>
       <w:szCs w:val="32"/>
     </w:rPr>
@@ -1629,7 +2800,6 @@
   <w:style w:type="character" w:default="1" w:styleId="Fuentedeprrafopredeter">
     <w:name w:val="Default Paragraph Font"/>
     <w:uiPriority w:val="1"/>
-    <w:semiHidden/>
     <w:unhideWhenUsed/>
   </w:style>
   <w:style w:type="table" w:default="1" w:styleId="Tablanormal">
@@ -1680,7 +2850,6 @@
     <w:basedOn w:val="Normal"/>
     <w:next w:val="Textoindependiente"/>
     <w:qFormat/>
-    <w:rsid w:val="00A96C48"/>
     <w:pPr>
       <w:keepNext/>
       <w:keepLines/>
@@ -1691,7 +2860,7 @@
       <w:rFonts w:asciiTheme="majorHAnsi" w:eastAsiaTheme="majorEastAsia" w:hAnsiTheme="majorHAnsi" w:cstheme="majorBidi"/>
       <w:b/>
       <w:bCs/>
-      <w:color w:val="FF0000"/>
+      <w:color w:val="345A8A" w:themeColor="accent1" w:themeShade="B5"/>
       <w:sz w:val="36"/>
       <w:szCs w:val="36"/>
     </w:rPr>
@@ -1756,17 +2925,10 @@
     <w:uiPriority w:val="9"/>
     <w:unhideWhenUsed/>
     <w:qFormat/>
-    <w:rsid w:val="002A4EBD"/>
     <w:pPr>
       <w:spacing w:before="100" w:after="100"/>
       <w:ind w:left="480" w:right="480"/>
-      <w:jc w:val="both"/>
     </w:pPr>
-    <w:rPr>
-      <w:sz w:val="22"/>
-      <w:szCs w:val="22"/>
-      <w:lang w:val="es-PE"/>
-    </w:rPr>
   </w:style>
   <w:style w:type="paragraph" w:styleId="Textonotapie">
     <w:name w:val="footnote text"/>
@@ -2521,4 +3683,16 @@
   </a:objectDefaults>
   <a:extraClrSchemeLst/>
 </a:theme>
+</file>
+
+<file path=customXml/item1.xml><?xml version="1.0" encoding="utf-8"?>
+<b:Sources xmlns:b="http://schemas.openxmlformats.org/officeDocument/2006/bibliography" xmlns="http://schemas.openxmlformats.org/officeDocument/2006/bibliography" SelectedStyle="\APASixthEditionOfficeOnline.xsl" StyleName="APA" Version="6"/>
+</file>
+
+<file path=customXml/itemProps1.xml><?xml version="1.0" encoding="utf-8"?>
+<ds:datastoreItem xmlns:ds="http://schemas.openxmlformats.org/officeDocument/2006/customXml" ds:itemID="{29C9767D-1D2F-4AD8-BE5B-A33239F44BCE}">
+  <ds:schemaRefs>
+    <ds:schemaRef ds:uri="http://schemas.openxmlformats.org/officeDocument/2006/bibliography"/>
+  </ds:schemaRefs>
+</ds:datastoreItem>
 </file>
</xml_diff>